<commit_message>
Deploying to gh-pages from @ Morrison-Lab/mds@e408e67bdbe47f77baeb41b2ac80d995932ad476 🚀
</commit_message>
<xml_diff>
--- a/sets-functions.docx
+++ b/sets-functions.docx
@@ -15,7 +15,7 @@
         <w:pStyle w:val="Date"/>
       </w:pPr>
       <w:r>
-        <w:t xml:space="preserve">Last modified: 2026-10-03 01:52:07 (PDT)</w:t>
+        <w:t xml:space="preserve">Last modified: 2026-10-03 02:20:36 (PDT)</w:t>
       </w:r>
     </w:p>
     <w:p>
@@ -54,7 +54,7 @@
         <w:t xml:space="preserve">that the Morrison Lab’s probability and statistics notes build on.</w:t>
       </w:r>
     </w:p>
-    <w:bookmarkStart w:id="30" w:name="sets"/>
+    <w:bookmarkStart w:id="32" w:name="sets"/>
     <w:p>
       <w:pPr>
         <w:pStyle w:val="Heading2"/>
@@ -2317,7 +2317,7 @@
         <w:t xml:space="preserve"> </w:t>
       </w:r>
       <w:r>
-        <w:t xml:space="preserve">if</w:t>
+        <w:t xml:space="preserve">if every element of</w:t>
       </w:r>
       <w:r>
         <w:t xml:space="preserve"> </w:t>
@@ -2331,10 +2331,78 @@
         <w:t xml:space="preserve"> </w:t>
       </w:r>
       <w:r>
-        <w:t xml:space="preserve">is a</w:t>
-      </w:r>
-      <w:r>
-        <w:t xml:space="preserve"> </w:t>
+        <w:t xml:space="preserve">is an element of</w:t>
+      </w:r>
+      <w:r>
+        <w:t xml:space="preserve"> </w:t>
+      </w:r>
+      <m:oMath>
+        <m:r>
+          <m:t>B</m:t>
+        </m:r>
+      </m:oMath>
+      <w:r>
+        <w:t xml:space="preserve">.</w:t>
+      </w:r>
+    </w:p>
+    <w:bookmarkEnd w:id="21"/>
+    <w:bookmarkStart w:id="22" w:name="rem-superset-subset"/>
+    <w:p>
+      <w:pPr>
+        <w:pStyle w:val="BodyText"/>
+      </w:pPr>
+      <w:r>
+        <w:rPr>
+          <w:i/>
+          <w:iCs/>
+        </w:rPr>
+        <w:t xml:space="preserve">Remark 3</w:t>
+      </w:r>
+      <w:r>
+        <w:t xml:space="preserve"> (Superset and subset). </w:t>
+      </w:r>
+      <m:oMath>
+        <m:r>
+          <m:t>B</m:t>
+        </m:r>
+        <m:r>
+          <m:rPr>
+            <m:sty m:val="p"/>
+          </m:rPr>
+          <m:t>⊇</m:t>
+        </m:r>
+        <m:r>
+          <m:t>A</m:t>
+        </m:r>
+      </m:oMath>
+      <w:r>
+        <w:t xml:space="preserve"> </w:t>
+      </w:r>
+      <w:r>
+        <w:t xml:space="preserve">means the same thing as</w:t>
+      </w:r>
+      <w:r>
+        <w:t xml:space="preserve"> </w:t>
+      </w:r>
+      <m:oMath>
+        <m:r>
+          <m:t>A</m:t>
+        </m:r>
+        <m:r>
+          <m:rPr>
+            <m:sty m:val="p"/>
+          </m:rPr>
+          <m:t>⊆</m:t>
+        </m:r>
+        <m:r>
+          <m:t>B</m:t>
+        </m:r>
+      </m:oMath>
+      <w:r>
+        <w:t xml:space="preserve"> </w:t>
+      </w:r>
+      <w:r>
+        <w:t xml:space="preserve">(</w:t>
       </w:r>
       <w:hyperlink w:anchor="def-subset">
         <w:r>
@@ -2345,25 +2413,181 @@
         </w:r>
       </w:hyperlink>
       <w:r>
-        <w:t xml:space="preserve"> </w:t>
-      </w:r>
-      <w:r>
-        <w:t xml:space="preserve">of</w:t>
-      </w:r>
-      <w:r>
-        <w:t xml:space="preserve"> </w:t>
-      </w:r>
-      <m:oMath>
-        <m:r>
-          <m:t>B</m:t>
+        <w:t xml:space="preserve">).</w:t>
+      </w:r>
+      <w:r>
+        <w:t xml:space="preserve"> </w:t>
+      </w:r>
+      <w:r>
+        <w:t xml:space="preserve">For example,</w:t>
+      </w:r>
+      <w:r>
+        <w:t xml:space="preserve"> </w:t>
+      </w:r>
+      <m:oMath>
+        <m:r>
+          <m:t>​</m:t>
+        </m:r>
+        <m:d>
+          <m:dPr>
+            <m:begChr m:val="{"/>
+            <m:sepChr m:val=""/>
+            <m:endChr m:val="}"/>
+            <m:grow/>
+          </m:dPr>
+          <m:e>
+            <m:r>
+              <m:t>1</m:t>
+            </m:r>
+            <m:r>
+              <m:rPr>
+                <m:sty m:val="p"/>
+              </m:rPr>
+              <m:t>,</m:t>
+            </m:r>
+            <m:r>
+              <m:t>2</m:t>
+            </m:r>
+            <m:r>
+              <m:rPr>
+                <m:sty m:val="p"/>
+              </m:rPr>
+              <m:t>,</m:t>
+            </m:r>
+            <m:r>
+              <m:t>3</m:t>
+            </m:r>
+          </m:e>
+        </m:d>
+        <m:r>
+          <m:t>​</m:t>
+        </m:r>
+        <m:r>
+          <m:rPr>
+            <m:sty m:val="p"/>
+          </m:rPr>
+          <m:t>⊇</m:t>
+        </m:r>
+        <m:r>
+          <m:t>​</m:t>
+        </m:r>
+        <m:d>
+          <m:dPr>
+            <m:begChr m:val="{"/>
+            <m:sepChr m:val=""/>
+            <m:endChr m:val="}"/>
+            <m:grow/>
+          </m:dPr>
+          <m:e>
+            <m:r>
+              <m:t>1</m:t>
+            </m:r>
+            <m:r>
+              <m:rPr>
+                <m:sty m:val="p"/>
+              </m:rPr>
+              <m:t>,</m:t>
+            </m:r>
+            <m:r>
+              <m:t>3</m:t>
+            </m:r>
+          </m:e>
+        </m:d>
+        <m:r>
+          <m:t>​</m:t>
+        </m:r>
+      </m:oMath>
+      <w:r>
+        <w:t xml:space="preserve">,</w:t>
+      </w:r>
+      <w:r>
+        <w:t xml:space="preserve"> </w:t>
+      </w:r>
+      <w:r>
+        <w:t xml:space="preserve">and</w:t>
+      </w:r>
+      <w:r>
+        <w:t xml:space="preserve"> </w:t>
+      </w:r>
+      <m:oMath>
+        <m:r>
+          <m:t>​</m:t>
+        </m:r>
+        <m:d>
+          <m:dPr>
+            <m:begChr m:val="{"/>
+            <m:sepChr m:val=""/>
+            <m:endChr m:val="}"/>
+            <m:grow/>
+          </m:dPr>
+          <m:e>
+            <m:r>
+              <m:t>1</m:t>
+            </m:r>
+            <m:r>
+              <m:rPr>
+                <m:sty m:val="p"/>
+              </m:rPr>
+              <m:t>,</m:t>
+            </m:r>
+            <m:r>
+              <m:t>3</m:t>
+            </m:r>
+          </m:e>
+        </m:d>
+        <m:r>
+          <m:t>​</m:t>
+        </m:r>
+        <m:r>
+          <m:rPr>
+            <m:sty m:val="p"/>
+          </m:rPr>
+          <m:t>⊆</m:t>
+        </m:r>
+        <m:r>
+          <m:t>​</m:t>
+        </m:r>
+        <m:d>
+          <m:dPr>
+            <m:begChr m:val="{"/>
+            <m:sepChr m:val=""/>
+            <m:endChr m:val="}"/>
+            <m:grow/>
+          </m:dPr>
+          <m:e>
+            <m:r>
+              <m:t>1</m:t>
+            </m:r>
+            <m:r>
+              <m:rPr>
+                <m:sty m:val="p"/>
+              </m:rPr>
+              <m:t>,</m:t>
+            </m:r>
+            <m:r>
+              <m:t>2</m:t>
+            </m:r>
+            <m:r>
+              <m:rPr>
+                <m:sty m:val="p"/>
+              </m:rPr>
+              <m:t>,</m:t>
+            </m:r>
+            <m:r>
+              <m:t>3</m:t>
+            </m:r>
+          </m:e>
+        </m:d>
+        <m:r>
+          <m:t>​</m:t>
         </m:r>
       </m:oMath>
       <w:r>
         <w:t xml:space="preserve">.</w:t>
       </w:r>
     </w:p>
-    <w:bookmarkEnd w:id="21"/>
-    <w:bookmarkStart w:id="22" w:name="def-strict-superset"/>
+    <w:bookmarkEnd w:id="22"/>
+    <w:bookmarkStart w:id="23" w:name="def-strict-superset"/>
     <w:p>
       <w:pPr>
         <w:pStyle w:val="BodyText"/>
@@ -2459,6 +2683,37 @@
       </w:r>
       <m:oMath>
         <m:r>
+          <m:t>B</m:t>
+        </m:r>
+      </m:oMath>
+      <w:r>
+        <w:t xml:space="preserve"> </w:t>
+      </w:r>
+      <w:r>
+        <w:t xml:space="preserve">is a</w:t>
+      </w:r>
+      <w:r>
+        <w:t xml:space="preserve"> </w:t>
+      </w:r>
+      <w:hyperlink w:anchor="def-superset">
+        <w:r>
+          <w:rPr>
+            <w:rStyle w:val="Hyperlink"/>
+          </w:rPr>
+          <w:t xml:space="preserve">superset</w:t>
+        </w:r>
+      </w:hyperlink>
+      <w:r>
+        <w:t xml:space="preserve"> </w:t>
+      </w:r>
+      <w:r>
+        <w:t xml:space="preserve">of</w:t>
+      </w:r>
+      <w:r>
+        <w:t xml:space="preserve"> </w:t>
+      </w:r>
+      <m:oMath>
+        <m:r>
           <m:t>A</m:t>
         </m:r>
       </m:oMath>
@@ -2466,10 +2721,87 @@
         <w:t xml:space="preserve"> </w:t>
       </w:r>
       <w:r>
-        <w:t xml:space="preserve">is a</w:t>
-      </w:r>
-      <w:r>
-        <w:t xml:space="preserve"> </w:t>
+        <w:t xml:space="preserve">and</w:t>
+      </w:r>
+      <w:r>
+        <w:t xml:space="preserve"> </w:t>
+      </w:r>
+      <m:oMath>
+        <m:r>
+          <m:t>B</m:t>
+        </m:r>
+        <m:r>
+          <m:rPr>
+            <m:sty m:val="p"/>
+          </m:rPr>
+          <m:t>≠</m:t>
+        </m:r>
+        <m:r>
+          <m:t>A</m:t>
+        </m:r>
+      </m:oMath>
+      <w:r>
+        <w:t xml:space="preserve">.</w:t>
+      </w:r>
+    </w:p>
+    <w:bookmarkEnd w:id="23"/>
+    <w:bookmarkStart w:id="24" w:name="rem-strict-superset-subset"/>
+    <w:p>
+      <w:pPr>
+        <w:pStyle w:val="BodyText"/>
+      </w:pPr>
+      <w:r>
+        <w:rPr>
+          <w:i/>
+          <w:iCs/>
+        </w:rPr>
+        <w:t xml:space="preserve">Remark 4</w:t>
+      </w:r>
+      <w:r>
+        <w:t xml:space="preserve"> (Strict superset and strict subset). </w:t>
+      </w:r>
+      <m:oMath>
+        <m:r>
+          <m:t>B</m:t>
+        </m:r>
+        <m:r>
+          <m:rPr>
+            <m:sty m:val="p"/>
+          </m:rPr>
+          <m:t>⊋</m:t>
+        </m:r>
+        <m:r>
+          <m:t>A</m:t>
+        </m:r>
+      </m:oMath>
+      <w:r>
+        <w:t xml:space="preserve"> </w:t>
+      </w:r>
+      <w:r>
+        <w:t xml:space="preserve">means the same thing as</w:t>
+      </w:r>
+      <w:r>
+        <w:t xml:space="preserve"> </w:t>
+      </w:r>
+      <m:oMath>
+        <m:r>
+          <m:t>A</m:t>
+        </m:r>
+        <m:r>
+          <m:rPr>
+            <m:sty m:val="p"/>
+          </m:rPr>
+          <m:t>⊊</m:t>
+        </m:r>
+        <m:r>
+          <m:t>B</m:t>
+        </m:r>
+      </m:oMath>
+      <w:r>
+        <w:t xml:space="preserve"> </w:t>
+      </w:r>
+      <w:r>
+        <w:t xml:space="preserve">(</w:t>
       </w:r>
       <w:hyperlink w:anchor="def-strict-subset">
         <w:r>
@@ -2480,25 +2812,203 @@
         </w:r>
       </w:hyperlink>
       <w:r>
-        <w:t xml:space="preserve"> </w:t>
-      </w:r>
-      <w:r>
-        <w:t xml:space="preserve">of</w:t>
-      </w:r>
-      <w:r>
-        <w:t xml:space="preserve"> </w:t>
-      </w:r>
-      <m:oMath>
-        <m:r>
-          <m:t>B</m:t>
-        </m:r>
-      </m:oMath>
-      <w:r>
-        <w:t xml:space="preserve">.</w:t>
+        <w:t xml:space="preserve">).</w:t>
+      </w:r>
+      <w:r>
+        <w:t xml:space="preserve"> </w:t>
+      </w:r>
+      <w:r>
+        <w:t xml:space="preserve">For example,</w:t>
+      </w:r>
+      <w:r>
+        <w:t xml:space="preserve"> </w:t>
+      </w:r>
+      <m:oMath>
+        <m:r>
+          <m:t>​</m:t>
+        </m:r>
+        <m:d>
+          <m:dPr>
+            <m:begChr m:val="{"/>
+            <m:sepChr m:val=""/>
+            <m:endChr m:val="}"/>
+            <m:grow/>
+          </m:dPr>
+          <m:e>
+            <m:r>
+              <m:t>1</m:t>
+            </m:r>
+            <m:r>
+              <m:rPr>
+                <m:sty m:val="p"/>
+              </m:rPr>
+              <m:t>,</m:t>
+            </m:r>
+            <m:r>
+              <m:t>2</m:t>
+            </m:r>
+            <m:r>
+              <m:rPr>
+                <m:sty m:val="p"/>
+              </m:rPr>
+              <m:t>,</m:t>
+            </m:r>
+            <m:r>
+              <m:t>3</m:t>
+            </m:r>
+          </m:e>
+        </m:d>
+        <m:r>
+          <m:t>​</m:t>
+        </m:r>
+        <m:r>
+          <m:rPr>
+            <m:sty m:val="p"/>
+          </m:rPr>
+          <m:t>⊋</m:t>
+        </m:r>
+        <m:r>
+          <m:t>​</m:t>
+        </m:r>
+        <m:d>
+          <m:dPr>
+            <m:begChr m:val="{"/>
+            <m:sepChr m:val=""/>
+            <m:endChr m:val="}"/>
+            <m:grow/>
+          </m:dPr>
+          <m:e>
+            <m:r>
+              <m:t>1</m:t>
+            </m:r>
+            <m:r>
+              <m:rPr>
+                <m:sty m:val="p"/>
+              </m:rPr>
+              <m:t>,</m:t>
+            </m:r>
+            <m:r>
+              <m:t>3</m:t>
+            </m:r>
+          </m:e>
+        </m:d>
+        <m:r>
+          <m:t>​</m:t>
+        </m:r>
+      </m:oMath>
+      <w:r>
+        <w:t xml:space="preserve">,</w:t>
+      </w:r>
+      <w:r>
+        <w:t xml:space="preserve"> </w:t>
+      </w:r>
+      <w:r>
+        <w:t xml:space="preserve">because</w:t>
+      </w:r>
+      <w:r>
+        <w:t xml:space="preserve"> </w:t>
+      </w:r>
+      <m:oMath>
+        <m:r>
+          <m:t>​</m:t>
+        </m:r>
+        <m:d>
+          <m:dPr>
+            <m:begChr m:val="{"/>
+            <m:sepChr m:val=""/>
+            <m:endChr m:val="}"/>
+            <m:grow/>
+          </m:dPr>
+          <m:e>
+            <m:r>
+              <m:t>1</m:t>
+            </m:r>
+            <m:r>
+              <m:rPr>
+                <m:sty m:val="p"/>
+              </m:rPr>
+              <m:t>,</m:t>
+            </m:r>
+            <m:r>
+              <m:t>2</m:t>
+            </m:r>
+            <m:r>
+              <m:rPr>
+                <m:sty m:val="p"/>
+              </m:rPr>
+              <m:t>,</m:t>
+            </m:r>
+            <m:r>
+              <m:t>3</m:t>
+            </m:r>
+          </m:e>
+        </m:d>
+        <m:r>
+          <m:t>​</m:t>
+        </m:r>
+      </m:oMath>
+      <w:r>
+        <w:t xml:space="preserve"> </w:t>
+      </w:r>
+      <w:r>
+        <w:t xml:space="preserve">contains</w:t>
+      </w:r>
+      <w:r>
+        <w:t xml:space="preserve"> </w:t>
+      </w:r>
+      <m:oMath>
+        <m:r>
+          <m:t>2</m:t>
+        </m:r>
+      </m:oMath>
+      <w:r>
+        <w:t xml:space="preserve"> </w:t>
+      </w:r>
+      <w:r>
+        <w:t xml:space="preserve">and</w:t>
+      </w:r>
+      <w:r>
+        <w:t xml:space="preserve"> </w:t>
+      </w:r>
+      <m:oMath>
+        <m:r>
+          <m:t>​</m:t>
+        </m:r>
+        <m:d>
+          <m:dPr>
+            <m:begChr m:val="{"/>
+            <m:sepChr m:val=""/>
+            <m:endChr m:val="}"/>
+            <m:grow/>
+          </m:dPr>
+          <m:e>
+            <m:r>
+              <m:t>1</m:t>
+            </m:r>
+            <m:r>
+              <m:rPr>
+                <m:sty m:val="p"/>
+              </m:rPr>
+              <m:t>,</m:t>
+            </m:r>
+            <m:r>
+              <m:t>3</m:t>
+            </m:r>
+          </m:e>
+        </m:d>
+        <m:r>
+          <m:t>​</m:t>
+        </m:r>
+      </m:oMath>
+      <w:r>
+        <w:t xml:space="preserve"> </w:t>
+      </w:r>
+      <w:r>
+        <w:t xml:space="preserve">does not.</w:t>
       </w:r>
     </w:p>
-    <w:bookmarkEnd w:id="22"/>
-    <w:bookmarkStart w:id="23" w:name="exm-strict-subset-superset"/>
+    <w:bookmarkEnd w:id="24"/>
+    <w:bookmarkStart w:id="25" w:name="exm-strict-subset-superset"/>
     <w:p>
       <w:pPr>
         <w:pStyle w:val="BodyText"/>
@@ -2887,8 +3397,8 @@
         <w:t xml:space="preserve">.</w:t>
       </w:r>
     </w:p>
-    <w:bookmarkEnd w:id="23"/>
-    <w:bookmarkStart w:id="24" w:name="def-empty-set"/>
+    <w:bookmarkEnd w:id="25"/>
+    <w:bookmarkStart w:id="26" w:name="def-empty-set"/>
     <w:p>
       <w:pPr>
         <w:pStyle w:val="FirstParagraph"/>
@@ -2940,8 +3450,8 @@
         <w:t xml:space="preserve">is the set that has no elements.</w:t>
       </w:r>
     </w:p>
-    <w:bookmarkEnd w:id="24"/>
-    <w:bookmarkStart w:id="26" w:name="rem-empty-set-notation"/>
+    <w:bookmarkEnd w:id="26"/>
+    <w:bookmarkStart w:id="28" w:name="rem-empty-set-notation"/>
     <w:p>
       <w:pPr>
         <w:pStyle w:val="BodyText"/>
@@ -2951,7 +3461,7 @@
           <w:i/>
           <w:iCs/>
         </w:rPr>
-        <w:t xml:space="preserve">Remark 3</w:t>
+        <w:t xml:space="preserve">Remark 5</w:t>
       </w:r>
       <w:r>
         <w:t xml:space="preserve"> (Other notation for the empty set). </w:t>
@@ -3005,7 +3515,7 @@
       <w:r>
         <w:t xml:space="preserve"> </w:t>
       </w:r>
-      <w:hyperlink r:id="rId25">
+      <w:hyperlink r:id="rId27">
         <w:r>
           <w:rPr>
             <w:rStyle w:val="Hyperlink"/>
@@ -3203,8 +3713,8 @@
         <w:t xml:space="preserve">.</w:t>
       </w:r>
     </w:p>
-    <w:bookmarkEnd w:id="26"/>
-    <w:bookmarkStart w:id="27" w:name="exm-empty-set"/>
+    <w:bookmarkEnd w:id="28"/>
+    <w:bookmarkStart w:id="29" w:name="exm-empty-set"/>
     <w:p>
       <w:pPr>
         <w:pStyle w:val="BodyText"/>
@@ -3356,8 +3866,8 @@
         <w:t xml:space="preserve">.</w:t>
       </w:r>
     </w:p>
-    <w:bookmarkEnd w:id="27"/>
-    <w:bookmarkStart w:id="28" w:name="thm-empty-set-unique"/>
+    <w:bookmarkEnd w:id="29"/>
+    <w:bookmarkStart w:id="30" w:name="thm-empty-set-unique"/>
     <w:p>
       <w:pPr>
         <w:pStyle w:val="BodyText"/>
@@ -3466,7 +3976,7 @@
         <w:t xml:space="preserve">.</w:t>
       </w:r>
     </w:p>
-    <w:bookmarkEnd w:id="28"/>
+    <w:bookmarkEnd w:id="30"/>
     <w:p>
       <w:pPr>
         <w:pStyle w:val="BodyText"/>
@@ -3554,7 +4064,7 @@
         <w:t xml:space="preserve">).</w:t>
       </w:r>
     </w:p>
-    <w:bookmarkStart w:id="29" w:name="thm-empty-subset"/>
+    <w:bookmarkStart w:id="31" w:name="thm-empty-subset"/>
     <w:p>
       <w:pPr>
         <w:pStyle w:val="BodyText"/>
@@ -3607,7 +4117,7 @@
         <w:t xml:space="preserve">.</w:t>
       </w:r>
     </w:p>
-    <w:bookmarkEnd w:id="29"/>
+    <w:bookmarkEnd w:id="31"/>
     <w:p>
       <w:pPr>
         <w:pStyle w:val="BodyText"/>
@@ -3729,8 +4239,8 @@
         <w:t xml:space="preserve">so no such element exists.</w:t>
       </w:r>
     </w:p>
-    <w:bookmarkEnd w:id="30"/>
-    <w:bookmarkStart w:id="35" w:name="combining-sets"/>
+    <w:bookmarkEnd w:id="32"/>
+    <w:bookmarkStart w:id="37" w:name="combining-sets"/>
     <w:p>
       <w:pPr>
         <w:pStyle w:val="Heading2"/>
@@ -3739,7 +4249,7 @@
         <w:t xml:space="preserve">2 Combining sets</w:t>
       </w:r>
     </w:p>
-    <w:bookmarkStart w:id="31" w:name="def-union"/>
+    <w:bookmarkStart w:id="33" w:name="def-union"/>
     <w:p>
       <w:pPr>
         <w:pStyle w:val="FirstParagraph"/>
@@ -4077,8 +4587,8 @@
         <w:t xml:space="preserve">.</w:t>
       </w:r>
     </w:p>
-    <w:bookmarkEnd w:id="31"/>
-    <w:bookmarkStart w:id="32" w:name="def-intersection"/>
+    <w:bookmarkEnd w:id="33"/>
+    <w:bookmarkStart w:id="34" w:name="def-intersection"/>
     <w:p>
       <w:pPr>
         <w:pStyle w:val="BodyText"/>
@@ -4419,8 +4929,8 @@
         <w:t xml:space="preserve">.</w:t>
       </w:r>
     </w:p>
-    <w:bookmarkEnd w:id="32"/>
-    <w:bookmarkStart w:id="33" w:name="def-set-difference"/>
+    <w:bookmarkEnd w:id="34"/>
+    <w:bookmarkStart w:id="35" w:name="def-set-difference"/>
     <w:p>
       <w:pPr>
         <w:pStyle w:val="BodyText"/>
@@ -4626,8 +5136,8 @@
         </m:oMath>
       </m:oMathPara>
     </w:p>
-    <w:bookmarkEnd w:id="33"/>
-    <w:bookmarkStart w:id="34" w:name="exm-set-operations"/>
+    <w:bookmarkEnd w:id="35"/>
+    <w:bookmarkStart w:id="36" w:name="exm-set-operations"/>
     <w:p>
       <w:pPr>
         <w:pStyle w:val="FirstParagraph"/>
@@ -5070,9 +5580,9 @@
         <w:t xml:space="preserve">: no roll is both even and odd.</w:t>
       </w:r>
     </w:p>
-    <w:bookmarkEnd w:id="34"/>
-    <w:bookmarkEnd w:id="35"/>
-    <w:bookmarkStart w:id="42" w:name="countable-sets"/>
+    <w:bookmarkEnd w:id="36"/>
+    <w:bookmarkEnd w:id="37"/>
+    <w:bookmarkStart w:id="44" w:name="countable-sets"/>
     <w:p>
       <w:pPr>
         <w:pStyle w:val="Heading2"/>
@@ -5081,7 +5591,7 @@
         <w:t xml:space="preserve">3 Countable sets</w:t>
       </w:r>
     </w:p>
-    <w:bookmarkStart w:id="36" w:name="def-countable-set"/>
+    <w:bookmarkStart w:id="38" w:name="def-countable-set"/>
     <w:p>
       <w:pPr>
         <w:pStyle w:val="FirstParagraph"/>
@@ -5193,8 +5703,8 @@
         <w:t xml:space="preserve">in which every element appears.</w:t>
       </w:r>
     </w:p>
-    <w:bookmarkEnd w:id="36"/>
-    <w:bookmarkStart w:id="37" w:name="def-countably-infinite"/>
+    <w:bookmarkEnd w:id="38"/>
+    <w:bookmarkStart w:id="39" w:name="def-countably-infinite"/>
     <w:p>
       <w:pPr>
         <w:pStyle w:val="BodyText"/>
@@ -5246,8 +5756,8 @@
         <w:t xml:space="preserve">and not finite.</w:t>
       </w:r>
     </w:p>
-    <w:bookmarkEnd w:id="37"/>
-    <w:bookmarkStart w:id="38" w:name="exm-countable-set"/>
+    <w:bookmarkEnd w:id="39"/>
+    <w:bookmarkStart w:id="40" w:name="exm-countable-set"/>
     <w:p>
       <w:pPr>
         <w:pStyle w:val="BodyText"/>
@@ -5585,8 +6095,8 @@
         <w:t xml:space="preserve">lists every one of them.</w:t>
       </w:r>
     </w:p>
-    <w:bookmarkEnd w:id="38"/>
-    <w:bookmarkStart w:id="39" w:name="thm-interval-uncountable"/>
+    <w:bookmarkEnd w:id="40"/>
+    <w:bookmarkStart w:id="41" w:name="thm-interval-uncountable"/>
     <w:p>
       <w:pPr>
         <w:pStyle w:val="FirstParagraph"/>
@@ -5654,8 +6164,8 @@
         <w:t xml:space="preserve">.</w:t>
       </w:r>
     </w:p>
-    <w:bookmarkEnd w:id="39"/>
-    <w:bookmarkStart w:id="41" w:name="rem-cantor-diagonal"/>
+    <w:bookmarkEnd w:id="41"/>
+    <w:bookmarkStart w:id="43" w:name="rem-cantor-diagonal"/>
     <w:p>
       <w:pPr>
         <w:pStyle w:val="BodyText"/>
@@ -5665,7 +6175,7 @@
           <w:i/>
           <w:iCs/>
         </w:rPr>
-        <w:t xml:space="preserve">Remark 4</w:t>
+        <w:t xml:space="preserve">Remark 6</w:t>
       </w:r>
       <w:r>
         <w:t xml:space="preserve"> (Cantor’s diagonal argument). </w:t>
@@ -5789,7 +6299,7 @@
       <w:r>
         <w:t xml:space="preserve"> </w:t>
       </w:r>
-      <w:hyperlink r:id="rId40">
+      <w:hyperlink r:id="rId42">
         <w:r>
           <w:rPr>
             <w:rStyle w:val="Hyperlink"/>
@@ -6016,9 +6526,9 @@
         <w:t xml:space="preserve">and from the third in the third digit.</w:t>
       </w:r>
     </w:p>
-    <w:bookmarkEnd w:id="41"/>
-    <w:bookmarkEnd w:id="42"/>
-    <w:bookmarkStart w:id="51" w:name="functions"/>
+    <w:bookmarkEnd w:id="43"/>
+    <w:bookmarkEnd w:id="44"/>
+    <w:bookmarkStart w:id="53" w:name="functions"/>
     <w:p>
       <w:pPr>
         <w:pStyle w:val="Heading2"/>
@@ -6027,7 +6537,7 @@
         <w:t xml:space="preserve">4 Functions</w:t>
       </w:r>
     </w:p>
-    <w:bookmarkStart w:id="43" w:name="def-function"/>
+    <w:bookmarkStart w:id="45" w:name="def-function"/>
     <w:p>
       <w:pPr>
         <w:pStyle w:val="FirstParagraph"/>
@@ -6225,8 +6735,8 @@
         <w:t xml:space="preserve">.</w:t>
       </w:r>
     </w:p>
-    <w:bookmarkEnd w:id="43"/>
-    <w:bookmarkStart w:id="44" w:name="exm-function"/>
+    <w:bookmarkEnd w:id="45"/>
+    <w:bookmarkStart w:id="46" w:name="exm-function"/>
     <w:p>
       <w:pPr>
         <w:pStyle w:val="BodyText"/>
@@ -6487,8 +6997,8 @@
         <w:t xml:space="preserve">because a function assigns exactly one value to each element.</w:t>
       </w:r>
     </w:p>
-    <w:bookmarkEnd w:id="44"/>
-    <w:bookmarkStart w:id="45" w:name="def-domain"/>
+    <w:bookmarkEnd w:id="46"/>
+    <w:bookmarkStart w:id="47" w:name="def-domain"/>
     <w:p>
       <w:pPr>
         <w:pStyle w:val="BodyText"/>
@@ -6594,8 +7104,8 @@
         <w:t xml:space="preserve">assigns values to.</w:t>
       </w:r>
     </w:p>
-    <w:bookmarkEnd w:id="45"/>
-    <w:bookmarkStart w:id="46" w:name="def-codomain"/>
+    <w:bookmarkEnd w:id="47"/>
+    <w:bookmarkStart w:id="48" w:name="def-codomain"/>
     <w:p>
       <w:pPr>
         <w:pStyle w:val="BodyText"/>
@@ -6687,8 +7197,8 @@
         <w:t xml:space="preserve">that its values are required to lie in.</w:t>
       </w:r>
     </w:p>
-    <w:bookmarkEnd w:id="46"/>
-    <w:bookmarkStart w:id="47" w:name="def-image"/>
+    <w:bookmarkEnd w:id="48"/>
+    <w:bookmarkStart w:id="49" w:name="def-image"/>
     <w:p>
       <w:pPr>
         <w:pStyle w:val="BodyText"/>
@@ -6881,8 +7391,8 @@
         </m:oMath>
       </m:oMathPara>
     </w:p>
-    <w:bookmarkEnd w:id="47"/>
-    <w:bookmarkStart w:id="49" w:name="rem-image-range"/>
+    <w:bookmarkEnd w:id="49"/>
+    <w:bookmarkStart w:id="51" w:name="rem-image-range"/>
     <w:p>
       <w:pPr>
         <w:pStyle w:val="FirstParagraph"/>
@@ -6892,7 +7402,7 @@
           <w:i/>
           <w:iCs/>
         </w:rPr>
-        <w:t xml:space="preserve">Remark 5</w:t>
+        <w:t xml:space="preserve">Remark 7</w:t>
       </w:r>
       <w:r>
         <w:t xml:space="preserve"> (Image and range). </w:t>
@@ -6958,7 +7468,7 @@
       <w:r>
         <w:t xml:space="preserve"> </w:t>
       </w:r>
-      <w:hyperlink r:id="rId48">
+      <w:hyperlink r:id="rId50">
         <w:r>
           <w:rPr>
             <w:rStyle w:val="Hyperlink"/>
@@ -7190,8 +7700,8 @@
         <w:t xml:space="preserve">.</w:t>
       </w:r>
     </w:p>
-    <w:bookmarkEnd w:id="49"/>
-    <w:bookmarkStart w:id="50" w:name="exm-domain-codomain-image"/>
+    <w:bookmarkEnd w:id="51"/>
+    <w:bookmarkStart w:id="52" w:name="exm-domain-codomain-image"/>
     <w:p>
       <w:pPr>
         <w:pStyle w:val="BodyText"/>
@@ -7619,9 +8129,9 @@
         <w:t xml:space="preserve">.</w:t>
       </w:r>
     </w:p>
-    <w:bookmarkEnd w:id="50"/>
-    <w:bookmarkEnd w:id="51"/>
-    <w:bookmarkStart w:id="56" w:name="extended-non-negative-real-numbers"/>
+    <w:bookmarkEnd w:id="52"/>
+    <w:bookmarkEnd w:id="53"/>
+    <w:bookmarkStart w:id="58" w:name="extended-non-negative-real-numbers"/>
     <w:p>
       <w:pPr>
         <w:pStyle w:val="Heading2"/>
@@ -7630,7 +8140,7 @@
         <w:t xml:space="preserve">5 Extended non-negative real numbers</w:t>
       </w:r>
     </w:p>
-    <w:bookmarkStart w:id="52" w:name="def-extended-nonneg-reals"/>
+    <w:bookmarkStart w:id="54" w:name="def-extended-nonneg-reals"/>
     <w:p>
       <w:pPr>
         <w:pStyle w:val="FirstParagraph"/>
@@ -7982,8 +8492,8 @@
         <w:t xml:space="preserve">.</w:t>
       </w:r>
     </w:p>
-    <w:bookmarkEnd w:id="52"/>
-    <w:bookmarkStart w:id="54" w:name="rem-infinity-arithmetic"/>
+    <w:bookmarkEnd w:id="54"/>
+    <w:bookmarkStart w:id="56" w:name="rem-infinity-arithmetic"/>
     <w:p>
       <w:pPr>
         <w:pStyle w:val="BodyText"/>
@@ -7993,7 +8503,7 @@
           <w:i/>
           <w:iCs/>
         </w:rPr>
-        <w:t xml:space="preserve">Remark 6</w:t>
+        <w:t xml:space="preserve">Remark 8</w:t>
       </w:r>
       <w:r>
         <w:t xml:space="preserve"> (Arithmetic with</w:t>
@@ -8187,7 +8697,7 @@
       <w:r>
         <w:t xml:space="preserve"> </w:t>
       </w:r>
-      <w:hyperlink r:id="rId53">
+      <w:hyperlink r:id="rId55">
         <w:r>
           <w:rPr>
             <w:rStyle w:val="Hyperlink"/>
@@ -8199,8 +8709,8 @@
         <w:t xml:space="preserve">).</w:t>
       </w:r>
     </w:p>
-    <w:bookmarkEnd w:id="54"/>
-    <w:bookmarkStart w:id="55" w:name="exm-extended-nonneg-reals"/>
+    <w:bookmarkEnd w:id="56"/>
+    <w:bookmarkStart w:id="57" w:name="exm-extended-nonneg-reals"/>
     <w:p>
       <w:pPr>
         <w:pStyle w:val="BodyText"/>
@@ -8390,8 +8900,8 @@
         <w:t xml:space="preserve">.</w:t>
       </w:r>
     </w:p>
-    <w:bookmarkEnd w:id="55"/>
-    <w:bookmarkEnd w:id="56"/>
+    <w:bookmarkEnd w:id="57"/>
+    <w:bookmarkEnd w:id="58"/>
     <w:sectPr>
       <w:footnotePr>
         <w:numRestart w:val="eachSect"/>

</xml_diff>

<commit_message>
Deploying to gh-pages from @ Morrison-Lab/mds@10aa10513dbfcb11bc29711d96076f0940387a71 🚀
</commit_message>
<xml_diff>
--- a/sets-functions.docx
+++ b/sets-functions.docx
@@ -15,7 +15,7 @@
         <w:pStyle w:val="Date"/>
       </w:pPr>
       <w:r>
-        <w:t xml:space="preserve">Last modified: 2026-10-05 21:01:53 (PDT)</w:t>
+        <w:t xml:space="preserve">Last modified: 2026-10-05 21:11:32 (PDT)</w:t>
       </w:r>
     </w:p>
     <w:p>
@@ -8926,7 +8926,7 @@
     </w:p>
     <w:bookmarkEnd w:id="42"/>
     <w:bookmarkEnd w:id="43"/>
-    <w:bookmarkStart w:id="62" w:name="functions"/>
+    <w:bookmarkStart w:id="64" w:name="functions"/>
     <w:p>
       <w:pPr>
         <w:pStyle w:val="Heading2"/>
@@ -9396,7 +9396,7 @@
       </w:r>
     </w:p>
     <w:bookmarkEnd w:id="45"/>
-    <w:bookmarkStart w:id="46" w:name="def-domain"/>
+    <w:bookmarkStart w:id="46" w:name="def-relation"/>
     <w:p>
       <w:pPr>
         <w:pStyle w:val="BodyText"/>
@@ -9406,7 +9406,382 @@
           <w:b/>
           <w:bCs/>
         </w:rPr>
-        <w:t xml:space="preserve">Definition 14 (Domain)</w:t>
+        <w:t xml:space="preserve">Definition 14 (Relation)</w:t>
+      </w:r>
+      <w:r>
+        <w:t xml:space="preserve"> </w:t>
+      </w:r>
+      <w:r>
+        <w:t xml:space="preserve">A</w:t>
+      </w:r>
+      <w:r>
+        <w:t xml:space="preserve"> </w:t>
+      </w:r>
+      <w:r>
+        <w:rPr>
+          <w:b/>
+          <w:bCs/>
+        </w:rPr>
+        <w:t xml:space="preserve">relation</w:t>
+      </w:r>
+      <w:r>
+        <w:t xml:space="preserve"> </w:t>
+      </w:r>
+      <m:oMath>
+        <m:r>
+          <m:rPr>
+            <m:sty m:val="p"/>
+          </m:rPr>
+          <m:t>∼</m:t>
+        </m:r>
+      </m:oMath>
+      <w:r>
+        <w:t xml:space="preserve"> </w:t>
+      </w:r>
+      <w:r>
+        <w:t xml:space="preserve">on a set</w:t>
+      </w:r>
+      <w:r>
+        <w:t xml:space="preserve"> </w:t>
+      </w:r>
+      <m:oMath>
+        <m:r>
+          <m:t>S</m:t>
+        </m:r>
+      </m:oMath>
+      <w:r>
+        <w:t xml:space="preserve"> </w:t>
+      </w:r>
+      <w:r>
+        <w:t xml:space="preserve">is a rule that,</w:t>
+      </w:r>
+      <w:r>
+        <w:t xml:space="preserve"> </w:t>
+      </w:r>
+      <w:r>
+        <w:t xml:space="preserve">for each ordered pair of elements</w:t>
+      </w:r>
+      <w:r>
+        <w:t xml:space="preserve"> </w:t>
+      </w:r>
+      <m:oMath>
+        <m:r>
+          <m:t>a</m:t>
+        </m:r>
+        <m:r>
+          <m:rPr>
+            <m:sty m:val="p"/>
+          </m:rPr>
+          <m:t>,</m:t>
+        </m:r>
+        <m:r>
+          <m:t>b</m:t>
+        </m:r>
+        <m:r>
+          <m:rPr>
+            <m:sty m:val="p"/>
+          </m:rPr>
+          <m:t>∈</m:t>
+        </m:r>
+        <m:r>
+          <m:t>S</m:t>
+        </m:r>
+      </m:oMath>
+      <w:r>
+        <w:t xml:space="preserve">,</w:t>
+      </w:r>
+      <w:r>
+        <w:t xml:space="preserve"> </w:t>
+      </w:r>
+      <w:r>
+        <w:t xml:space="preserve">says whether</w:t>
+      </w:r>
+      <w:r>
+        <w:t xml:space="preserve"> </w:t>
+      </w:r>
+      <m:oMath>
+        <m:r>
+          <m:t>a</m:t>
+        </m:r>
+        <m:r>
+          <m:rPr>
+            <m:sty m:val="p"/>
+          </m:rPr>
+          <m:t>∼</m:t>
+        </m:r>
+        <m:r>
+          <m:t>b</m:t>
+        </m:r>
+      </m:oMath>
+      <w:r>
+        <w:t xml:space="preserve"> </w:t>
+      </w:r>
+      <w:r>
+        <w:t xml:space="preserve">holds (</w:t>
+      </w:r>
+      <w:r>
+        <w:t xml:space="preserve">“</w:t>
+      </w:r>
+      <m:oMath>
+        <m:r>
+          <m:t>a</m:t>
+        </m:r>
+      </m:oMath>
+      <w:r>
+        <w:t xml:space="preserve"> </w:t>
+      </w:r>
+      <w:r>
+        <w:t xml:space="preserve">is related to</w:t>
+      </w:r>
+      <w:r>
+        <w:t xml:space="preserve"> </w:t>
+      </w:r>
+      <m:oMath>
+        <m:r>
+          <m:t>b</m:t>
+        </m:r>
+      </m:oMath>
+      <w:r>
+        <w:t xml:space="preserve">”</w:t>
+      </w:r>
+      <w:r>
+        <w:t xml:space="preserve">).</w:t>
+      </w:r>
+    </w:p>
+    <w:bookmarkEnd w:id="46"/>
+    <w:bookmarkStart w:id="47" w:name="exm-relation"/>
+    <w:p>
+      <w:pPr>
+        <w:pStyle w:val="BodyText"/>
+      </w:pPr>
+      <w:r>
+        <w:rPr>
+          <w:b/>
+          <w:bCs/>
+        </w:rPr>
+        <w:t xml:space="preserve">Example 10 (Relations on the real numbers)</w:t>
+      </w:r>
+      <w:r>
+        <w:t xml:space="preserve"> </w:t>
+      </w:r>
+      <m:oMath>
+        <m:r>
+          <m:rPr>
+            <m:sty m:val="p"/>
+          </m:rPr>
+          <m:t>=</m:t>
+        </m:r>
+      </m:oMath>
+      <w:r>
+        <w:t xml:space="preserve">,</w:t>
+      </w:r>
+      <w:r>
+        <w:t xml:space="preserve"> </w:t>
+      </w:r>
+      <m:oMath>
+        <m:r>
+          <m:rPr>
+            <m:sty m:val="p"/>
+          </m:rPr>
+          <m:t>&lt;</m:t>
+        </m:r>
+      </m:oMath>
+      <w:r>
+        <w:t xml:space="preserve"> </w:t>
+      </w:r>
+      <w:r>
+        <w:t xml:space="preserve">and</w:t>
+      </w:r>
+      <w:r>
+        <w:t xml:space="preserve"> </w:t>
+      </w:r>
+      <m:oMath>
+        <m:r>
+          <m:rPr>
+            <m:sty m:val="p"/>
+          </m:rPr>
+          <m:t>≤</m:t>
+        </m:r>
+      </m:oMath>
+      <w:r>
+        <w:t xml:space="preserve"> </w:t>
+      </w:r>
+      <w:r>
+        <w:t xml:space="preserve">are relations on</w:t>
+      </w:r>
+      <w:r>
+        <w:t xml:space="preserve"> </w:t>
+      </w:r>
+      <m:oMath>
+        <m:r>
+          <m:rPr>
+            <m:scr m:val="double-struck"/>
+            <m:sty m:val="p"/>
+          </m:rPr>
+          <m:t>R</m:t>
+        </m:r>
+      </m:oMath>
+      <w:r>
+        <w:t xml:space="preserve">.</w:t>
+      </w:r>
+      <w:r>
+        <w:t xml:space="preserve"> </w:t>
+      </w:r>
+      <w:r>
+        <w:t xml:space="preserve">For</w:t>
+      </w:r>
+      <w:r>
+        <w:t xml:space="preserve"> </w:t>
+      </w:r>
+      <m:oMath>
+        <m:r>
+          <m:rPr>
+            <m:sty m:val="p"/>
+          </m:rPr>
+          <m:t>&lt;</m:t>
+        </m:r>
+      </m:oMath>
+      <w:r>
+        <w:t xml:space="preserve">, the pair</w:t>
+      </w:r>
+      <w:r>
+        <w:t xml:space="preserve"> </w:t>
+      </w:r>
+      <m:oMath>
+        <m:r>
+          <m:rPr>
+            <m:sty m:val="p"/>
+          </m:rPr>
+          <m:t>(</m:t>
+        </m:r>
+        <m:r>
+          <m:t>2</m:t>
+        </m:r>
+        <m:r>
+          <m:rPr>
+            <m:sty m:val="p"/>
+          </m:rPr>
+          <m:t>,</m:t>
+        </m:r>
+        <m:r>
+          <m:t>5</m:t>
+        </m:r>
+        <m:r>
+          <m:rPr>
+            <m:sty m:val="p"/>
+          </m:rPr>
+          <m:t>)</m:t>
+        </m:r>
+      </m:oMath>
+      <w:r>
+        <w:t xml:space="preserve"> </w:t>
+      </w:r>
+      <w:r>
+        <w:t xml:space="preserve">is related, since</w:t>
+      </w:r>
+      <w:r>
+        <w:t xml:space="preserve"> </w:t>
+      </w:r>
+      <m:oMath>
+        <m:r>
+          <m:t>2</m:t>
+        </m:r>
+        <m:r>
+          <m:rPr>
+            <m:sty m:val="p"/>
+          </m:rPr>
+          <m:t>&lt;</m:t>
+        </m:r>
+        <m:r>
+          <m:t>5</m:t>
+        </m:r>
+      </m:oMath>
+      <w:r>
+        <w:t xml:space="preserve">,</w:t>
+      </w:r>
+      <w:r>
+        <w:t xml:space="preserve"> </w:t>
+      </w:r>
+      <w:r>
+        <w:t xml:space="preserve">but the pair</w:t>
+      </w:r>
+      <w:r>
+        <w:t xml:space="preserve"> </w:t>
+      </w:r>
+      <m:oMath>
+        <m:r>
+          <m:rPr>
+            <m:sty m:val="p"/>
+          </m:rPr>
+          <m:t>(</m:t>
+        </m:r>
+        <m:r>
+          <m:t>5</m:t>
+        </m:r>
+        <m:r>
+          <m:rPr>
+            <m:sty m:val="p"/>
+          </m:rPr>
+          <m:t>,</m:t>
+        </m:r>
+        <m:r>
+          <m:t>2</m:t>
+        </m:r>
+        <m:r>
+          <m:rPr>
+            <m:sty m:val="p"/>
+          </m:rPr>
+          <m:t>)</m:t>
+        </m:r>
+      </m:oMath>
+      <w:r>
+        <w:t xml:space="preserve"> </w:t>
+      </w:r>
+      <w:r>
+        <w:t xml:space="preserve">is not, since</w:t>
+      </w:r>
+      <w:r>
+        <w:t xml:space="preserve"> </w:t>
+      </w:r>
+      <m:oMath>
+        <m:r>
+          <m:t>5</m:t>
+        </m:r>
+        <m:r>
+          <m:rPr>
+            <m:sty m:val="p"/>
+          </m:rPr>
+          <m:t>&lt;</m:t>
+        </m:r>
+        <m:r>
+          <m:t>2</m:t>
+        </m:r>
+      </m:oMath>
+      <w:r>
+        <w:t xml:space="preserve"> </w:t>
+      </w:r>
+      <w:r>
+        <w:t xml:space="preserve">is false:</w:t>
+      </w:r>
+      <w:r>
+        <w:t xml:space="preserve"> </w:t>
+      </w:r>
+      <w:r>
+        <w:t xml:space="preserve">the order of the pair matters.</w:t>
+      </w:r>
+    </w:p>
+    <w:bookmarkEnd w:id="47"/>
+    <w:bookmarkStart w:id="48" w:name="def-domain"/>
+    <w:p>
+      <w:pPr>
+        <w:pStyle w:val="BodyText"/>
+      </w:pPr>
+      <w:r>
+        <w:rPr>
+          <w:b/>
+          <w:bCs/>
+        </w:rPr>
+        <w:t xml:space="preserve">Definition 15 (Domain)</w:t>
       </w:r>
       <w:r>
         <w:t xml:space="preserve"> </w:t>
@@ -9502,8 +9877,8 @@
         <w:t xml:space="preserve">assigns values to.</w:t>
       </w:r>
     </w:p>
-    <w:bookmarkEnd w:id="46"/>
-    <w:bookmarkStart w:id="47" w:name="def-codomain"/>
+    <w:bookmarkEnd w:id="48"/>
+    <w:bookmarkStart w:id="49" w:name="def-codomain"/>
     <w:p>
       <w:pPr>
         <w:pStyle w:val="BodyText"/>
@@ -9513,7 +9888,7 @@
           <w:b/>
           <w:bCs/>
         </w:rPr>
-        <w:t xml:space="preserve">Definition 15 (Codomain)</w:t>
+        <w:t xml:space="preserve">Definition 16 (Codomain)</w:t>
       </w:r>
       <w:r>
         <w:t xml:space="preserve"> </w:t>
@@ -9595,8 +9970,8 @@
         <w:t xml:space="preserve">that its values are required to lie in.</w:t>
       </w:r>
     </w:p>
-    <w:bookmarkEnd w:id="47"/>
-    <w:bookmarkStart w:id="48" w:name="def-image"/>
+    <w:bookmarkEnd w:id="49"/>
+    <w:bookmarkStart w:id="50" w:name="def-image"/>
     <w:p>
       <w:pPr>
         <w:pStyle w:val="BodyText"/>
@@ -9606,7 +9981,7 @@
           <w:b/>
           <w:bCs/>
         </w:rPr>
-        <w:t xml:space="preserve">Definition 16 (Image)</w:t>
+        <w:t xml:space="preserve">Definition 17 (Image)</w:t>
       </w:r>
       <w:r>
         <w:t xml:space="preserve"> </w:t>
@@ -9789,8 +10164,8 @@
         </m:oMath>
       </m:oMathPara>
     </w:p>
-    <w:bookmarkEnd w:id="48"/>
-    <w:bookmarkStart w:id="50" w:name="rem-image-range"/>
+    <w:bookmarkEnd w:id="50"/>
+    <w:bookmarkStart w:id="52" w:name="rem-image-range"/>
     <w:p>
       <w:pPr>
         <w:pStyle w:val="FirstParagraph"/>
@@ -9866,7 +10241,7 @@
       <w:r>
         <w:t xml:space="preserve"> </w:t>
       </w:r>
-      <w:hyperlink r:id="rId49">
+      <w:hyperlink r:id="rId51">
         <w:r>
           <w:rPr>
             <w:rStyle w:val="Hyperlink"/>
@@ -10098,8 +10473,8 @@
         <w:t xml:space="preserve">.</w:t>
       </w:r>
     </w:p>
-    <w:bookmarkEnd w:id="50"/>
-    <w:bookmarkStart w:id="51" w:name="exm-domain-codomain-image"/>
+    <w:bookmarkEnd w:id="52"/>
+    <w:bookmarkStart w:id="53" w:name="exm-domain-codomain-image"/>
     <w:p>
       <w:pPr>
         <w:pStyle w:val="BodyText"/>
@@ -10109,7 +10484,7 @@
           <w:b/>
           <w:bCs/>
         </w:rPr>
-        <w:t xml:space="preserve">Example 10 (Domain, codomain, and image of the doubled die roll)</w:t>
+        <w:t xml:space="preserve">Example 11 (Domain, codomain, and image of the doubled die roll)</w:t>
       </w:r>
       <w:r>
         <w:t xml:space="preserve"> </w:t>
@@ -10527,8 +10902,8 @@
         <w:t xml:space="preserve">.</w:t>
       </w:r>
     </w:p>
-    <w:bookmarkEnd w:id="51"/>
-    <w:bookmarkStart w:id="52" w:name="def-graph"/>
+    <w:bookmarkEnd w:id="53"/>
+    <w:bookmarkStart w:id="54" w:name="def-graph"/>
     <w:p>
       <w:pPr>
         <w:pStyle w:val="BodyText"/>
@@ -10538,7 +10913,7 @@
           <w:b/>
           <w:bCs/>
         </w:rPr>
-        <w:t xml:space="preserve">Definition 17 (Graph of a function)</w:t>
+        <w:t xml:space="preserve">Definition 18 (Graph of a function)</w:t>
       </w:r>
       <w:r>
         <w:t xml:space="preserve"> </w:t>
@@ -10852,8 +11227,8 @@
         <w:t xml:space="preserve">on the vertical axis.</w:t>
       </w:r>
     </w:p>
-    <w:bookmarkEnd w:id="52"/>
-    <w:bookmarkStart w:id="53" w:name="exm-graph"/>
+    <w:bookmarkEnd w:id="54"/>
+    <w:bookmarkStart w:id="55" w:name="exm-graph"/>
     <w:p>
       <w:pPr>
         <w:pStyle w:val="BodyText"/>
@@ -10863,7 +11238,7 @@
           <w:b/>
           <w:bCs/>
         </w:rPr>
-        <w:t xml:space="preserve">Example 11 (The graph of a function on three points)</w:t>
+        <w:t xml:space="preserve">Example 12 (The graph of a function on three points)</w:t>
       </w:r>
       <w:r>
         <w:t xml:space="preserve"> </w:t>
@@ -11309,8 +11684,8 @@
         <w:t xml:space="preserve">.</w:t>
       </w:r>
     </w:p>
-    <w:bookmarkEnd w:id="53"/>
-    <w:bookmarkStart w:id="54" w:name="def-composition"/>
+    <w:bookmarkEnd w:id="55"/>
+    <w:bookmarkStart w:id="56" w:name="def-composition"/>
     <w:p>
       <w:pPr>
         <w:pStyle w:val="BodyText"/>
@@ -11320,7 +11695,7 @@
           <w:b/>
           <w:bCs/>
         </w:rPr>
-        <w:t xml:space="preserve">Definition 18 (Composition)</w:t>
+        <w:t xml:space="preserve">Definition 19 (Composition)</w:t>
       </w:r>
       <w:r>
         <w:t xml:space="preserve"> </w:t>
@@ -11717,8 +12092,8 @@
         <w:t xml:space="preserve">, applied to the result.</w:t>
       </w:r>
     </w:p>
-    <w:bookmarkEnd w:id="54"/>
-    <w:bookmarkStart w:id="55" w:name="exm-composition"/>
+    <w:bookmarkEnd w:id="56"/>
+    <w:bookmarkStart w:id="57" w:name="exm-composition"/>
     <w:p>
       <w:pPr>
         <w:pStyle w:val="BodyText"/>
@@ -11728,7 +12103,7 @@
           <w:b/>
           <w:bCs/>
         </w:rPr>
-        <w:t xml:space="preserve">Example 12 (The order of composition matters)</w:t>
+        <w:t xml:space="preserve">Example 13 (The order of composition matters)</w:t>
       </w:r>
       <w:r>
         <w:t xml:space="preserve"> </w:t>
@@ -12297,8 +12672,8 @@
         <w:t xml:space="preserve">are different functions.</w:t>
       </w:r>
     </w:p>
-    <w:bookmarkEnd w:id="55"/>
-    <w:bookmarkStart w:id="56" w:name="def-inverse-function"/>
+    <w:bookmarkEnd w:id="57"/>
+    <w:bookmarkStart w:id="58" w:name="def-inverse-function"/>
     <w:p>
       <w:pPr>
         <w:pStyle w:val="BodyText"/>
@@ -12308,7 +12683,7 @@
           <w:b/>
           <w:bCs/>
         </w:rPr>
-        <w:t xml:space="preserve">Definition 19 (Inverse function)</w:t>
+        <w:t xml:space="preserve">Definition 20 (Inverse function)</w:t>
       </w:r>
       <w:r>
         <w:t xml:space="preserve"> </w:t>
@@ -12639,8 +13014,8 @@
         <w:t xml:space="preserve">.</w:t>
       </w:r>
     </w:p>
-    <w:bookmarkEnd w:id="56"/>
-    <w:bookmarkStart w:id="57" w:name="rem-inverse-not-reciprocal"/>
+    <w:bookmarkEnd w:id="58"/>
+    <w:bookmarkStart w:id="59" w:name="rem-inverse-not-reciprocal"/>
     <w:p>
       <w:pPr>
         <w:pStyle w:val="BodyText"/>
@@ -13038,8 +13413,8 @@
         <w:t xml:space="preserve">.</w:t>
       </w:r>
     </w:p>
-    <w:bookmarkEnd w:id="57"/>
-    <w:bookmarkStart w:id="58" w:name="exm-inverse-function"/>
+    <w:bookmarkEnd w:id="59"/>
+    <w:bookmarkStart w:id="60" w:name="exm-inverse-function"/>
     <w:p>
       <w:pPr>
         <w:pStyle w:val="BodyText"/>
@@ -13049,7 +13424,7 @@
           <w:b/>
           <w:bCs/>
         </w:rPr>
-        <w:t xml:space="preserve">Example 13 (An invertible function, and one that is not)</w:t>
+        <w:t xml:space="preserve">Example 14 (An invertible function, and one that is not)</w:t>
       </w:r>
       <w:r>
         <w:t xml:space="preserve"> </w:t>
@@ -13640,8 +14015,8 @@
         <w:t xml:space="preserve">is not invertible.</w:t>
       </w:r>
     </w:p>
-    <w:bookmarkEnd w:id="58"/>
-    <w:bookmarkStart w:id="60" w:name="def-sequence"/>
+    <w:bookmarkEnd w:id="60"/>
+    <w:bookmarkStart w:id="62" w:name="def-sequence"/>
     <w:p>
       <w:pPr>
         <w:pStyle w:val="FirstParagraph"/>
@@ -13651,7 +14026,7 @@
           <w:b/>
           <w:bCs/>
         </w:rPr>
-        <w:t xml:space="preserve">Definition 20 (Sequence)</w:t>
+        <w:t xml:space="preserve">Definition 21 (Sequence)</w:t>
       </w:r>
       <w:r>
         <w:t xml:space="preserve"> </w:t>
@@ -13739,7 +14114,7 @@
       <w:r>
         <w:t xml:space="preserve"> </w:t>
       </w:r>
-      <w:hyperlink r:id="rId59">
+      <w:hyperlink r:id="rId61">
         <w:r>
           <w:rPr>
             <w:rStyle w:val="Hyperlink"/>
@@ -14112,8 +14487,8 @@
         <w:t xml:space="preserve">.</w:t>
       </w:r>
     </w:p>
-    <w:bookmarkEnd w:id="60"/>
-    <w:bookmarkStart w:id="61" w:name="exm-sequence"/>
+    <w:bookmarkEnd w:id="62"/>
+    <w:bookmarkStart w:id="63" w:name="exm-sequence"/>
     <w:p>
       <w:pPr>
         <w:pStyle w:val="BodyText"/>
@@ -14123,7 +14498,7 @@
           <w:b/>
           <w:bCs/>
         </w:rPr>
-        <w:t xml:space="preserve">Example 14 (Sequences)</w:t>
+        <w:t xml:space="preserve">Example 15 (Sequences)</w:t>
       </w:r>
       <w:r>
         <w:t xml:space="preserve"> </w:t>
@@ -14687,9 +15062,9 @@
         <w:t xml:space="preserve">but as a sequence, the order and the repeats matter.</w:t>
       </w:r>
     </w:p>
-    <w:bookmarkEnd w:id="61"/>
-    <w:bookmarkEnd w:id="62"/>
-    <w:bookmarkStart w:id="77" w:name="countable-sets"/>
+    <w:bookmarkEnd w:id="63"/>
+    <w:bookmarkEnd w:id="64"/>
+    <w:bookmarkStart w:id="79" w:name="countable-sets"/>
     <w:p>
       <w:pPr>
         <w:pStyle w:val="Heading2"/>
@@ -14698,7 +15073,7 @@
         <w:t xml:space="preserve">4 Countable sets</w:t>
       </w:r>
     </w:p>
-    <w:bookmarkStart w:id="63" w:name="def-finite-set"/>
+    <w:bookmarkStart w:id="65" w:name="def-finite-set"/>
     <w:p>
       <w:pPr>
         <w:pStyle w:val="FirstParagraph"/>
@@ -14708,7 +15083,7 @@
           <w:b/>
           <w:bCs/>
         </w:rPr>
-        <w:t xml:space="preserve">Definition 21 (Finite set, infinite set, and cardinality)</w:t>
+        <w:t xml:space="preserve">Definition 22 (Finite set, infinite set, and cardinality)</w:t>
       </w:r>
       <w:r>
         <w:t xml:space="preserve"> </w:t>
@@ -14774,7 +15149,7 @@
           <w:rPr>
             <w:rStyle w:val="Hyperlink"/>
           </w:rPr>
-          <w:t xml:space="preserve">Definition 20</w:t>
+          <w:t xml:space="preserve">Definition 21</w:t>
         </w:r>
       </w:hyperlink>
       <w:r>
@@ -14994,8 +15369,8 @@
         <w:t xml:space="preserve">.</w:t>
       </w:r>
     </w:p>
-    <w:bookmarkEnd w:id="63"/>
-    <w:bookmarkStart w:id="66" w:name="rem-cardinality-bars"/>
+    <w:bookmarkEnd w:id="65"/>
+    <w:bookmarkStart w:id="68" w:name="rem-cardinality-bars"/>
     <w:p>
       <w:pPr>
         <w:pStyle w:val="BodyText"/>
@@ -15123,7 +15498,7 @@
       <w:r>
         <w:t xml:space="preserve"> </w:t>
       </w:r>
-      <w:hyperlink r:id="rId64">
+      <w:hyperlink r:id="rId66">
         <w:r>
           <w:rPr>
             <w:rStyle w:val="Hyperlink"/>
@@ -15143,7 +15518,7 @@
       <w:r>
         <w:t xml:space="preserve"> </w:t>
       </w:r>
-      <w:hyperlink r:id="rId65">
+      <w:hyperlink r:id="rId67">
         <w:r>
           <w:rPr>
             <w:rStyle w:val="Hyperlink"/>
@@ -15278,8 +15653,8 @@
         <w:t xml:space="preserve">.</w:t>
       </w:r>
     </w:p>
-    <w:bookmarkEnd w:id="66"/>
-    <w:bookmarkStart w:id="67" w:name="exm-finite-set"/>
+    <w:bookmarkEnd w:id="68"/>
+    <w:bookmarkStart w:id="69" w:name="exm-finite-set"/>
     <w:p>
       <w:pPr>
         <w:pStyle w:val="BodyText"/>
@@ -15289,7 +15664,7 @@
           <w:b/>
           <w:bCs/>
         </w:rPr>
-        <w:t xml:space="preserve">Example 15 (Finite and infinite sets)</w:t>
+        <w:t xml:space="preserve">Example 16 (Finite and infinite sets)</w:t>
       </w:r>
       <w:r>
         <w:t xml:space="preserve"> </w:t>
@@ -15871,8 +16246,8 @@
         <w:t xml:space="preserve">which is larger than every number in the list.</w:t>
       </w:r>
     </w:p>
-    <w:bookmarkEnd w:id="67"/>
-    <w:bookmarkStart w:id="68" w:name="def-countable-set"/>
+    <w:bookmarkEnd w:id="69"/>
+    <w:bookmarkStart w:id="70" w:name="def-countable-set"/>
     <w:p>
       <w:pPr>
         <w:pStyle w:val="FirstParagraph"/>
@@ -15882,7 +16257,7 @@
           <w:b/>
           <w:bCs/>
         </w:rPr>
-        <w:t xml:space="preserve">Definition 22 (Countable set)</w:t>
+        <w:t xml:space="preserve">Definition 23 (Countable set)</w:t>
       </w:r>
       <w:r>
         <w:t xml:space="preserve"> </w:t>
@@ -15907,6 +16282,23 @@
         <w:t xml:space="preserve">if it is finite (</w:t>
       </w:r>
       <w:hyperlink w:anchor="def-finite-set">
+        <w:r>
+          <w:rPr>
+            <w:rStyle w:val="Hyperlink"/>
+          </w:rPr>
+          <w:t xml:space="preserve">Definition 22</w:t>
+        </w:r>
+      </w:hyperlink>
+      <w:r>
+        <w:t xml:space="preserve">),</w:t>
+      </w:r>
+      <w:r>
+        <w:t xml:space="preserve"> </w:t>
+      </w:r>
+      <w:r>
+        <w:t xml:space="preserve">or if its elements can be listed as a sequence (</w:t>
+      </w:r>
+      <w:hyperlink w:anchor="def-sequence">
         <w:r>
           <w:rPr>
             <w:rStyle w:val="Hyperlink"/>
@@ -15915,23 +16307,6 @@
         </w:r>
       </w:hyperlink>
       <w:r>
-        <w:t xml:space="preserve">),</w:t>
-      </w:r>
-      <w:r>
-        <w:t xml:space="preserve"> </w:t>
-      </w:r>
-      <w:r>
-        <w:t xml:space="preserve">or if its elements can be listed as a sequence (</w:t>
-      </w:r>
-      <w:hyperlink w:anchor="def-sequence">
-        <w:r>
-          <w:rPr>
-            <w:rStyle w:val="Hyperlink"/>
-          </w:rPr>
-          <w:t xml:space="preserve">Definition 20</w:t>
-        </w:r>
-      </w:hyperlink>
-      <w:r>
         <w:t xml:space="preserve">)</w:t>
       </w:r>
       <w:r>
@@ -16006,8 +16381,8 @@
         <w:t xml:space="preserve">in which every element appears.</w:t>
       </w:r>
     </w:p>
-    <w:bookmarkEnd w:id="68"/>
-    <w:bookmarkStart w:id="69" w:name="def-countably-infinite"/>
+    <w:bookmarkEnd w:id="70"/>
+    <w:bookmarkStart w:id="71" w:name="def-countably-infinite"/>
     <w:p>
       <w:pPr>
         <w:pStyle w:val="BodyText"/>
@@ -16017,7 +16392,7 @@
           <w:b/>
           <w:bCs/>
         </w:rPr>
-        <w:t xml:space="preserve">Definition 23 (Countably infinite set)</w:t>
+        <w:t xml:space="preserve">Definition 24 (Countably infinite set)</w:t>
       </w:r>
       <w:r>
         <w:t xml:space="preserve"> </w:t>
@@ -16059,8 +16434,8 @@
         <w:t xml:space="preserve">and not finite.</w:t>
       </w:r>
     </w:p>
-    <w:bookmarkEnd w:id="69"/>
-    <w:bookmarkStart w:id="72" w:name="exm-countable-set"/>
+    <w:bookmarkEnd w:id="71"/>
+    <w:bookmarkStart w:id="74" w:name="exm-countable-set"/>
     <w:p>
       <w:pPr>
         <w:pStyle w:val="BodyText"/>
@@ -16070,7 +16445,7 @@
           <w:b/>
           <w:bCs/>
         </w:rPr>
-        <w:t xml:space="preserve">Example 16 (Countable and uncountable sets)</w:t>
+        <w:t xml:space="preserve">Example 17 (Countable and uncountable sets)</w:t>
       </w:r>
       <w:r>
         <w:t xml:space="preserve"> </w:t>
@@ -16174,7 +16549,7 @@
       <w:r>
         <w:t xml:space="preserve"> </w:t>
       </w:r>
-      <w:hyperlink r:id="rId70">
+      <w:hyperlink r:id="rId72">
         <w:r>
           <w:rPr>
             <w:rStyle w:val="Hyperlink"/>
@@ -16307,7 +16682,7 @@
       <w:r>
         <w:t xml:space="preserve"> </w:t>
       </w:r>
-      <w:hyperlink r:id="rId71">
+      <w:hyperlink r:id="rId73">
         <w:r>
           <w:rPr>
             <w:rStyle w:val="Hyperlink"/>
@@ -16426,8 +16801,8 @@
         <w:t xml:space="preserve">lists every one of them.</w:t>
       </w:r>
     </w:p>
-    <w:bookmarkEnd w:id="72"/>
-    <w:bookmarkStart w:id="73" w:name="thm-interval-uncountable"/>
+    <w:bookmarkEnd w:id="74"/>
+    <w:bookmarkStart w:id="75" w:name="thm-interval-uncountable"/>
     <w:p>
       <w:pPr>
         <w:pStyle w:val="FirstParagraph"/>
@@ -16495,8 +16870,8 @@
         <w:t xml:space="preserve">.</w:t>
       </w:r>
     </w:p>
-    <w:bookmarkEnd w:id="73"/>
-    <w:bookmarkStart w:id="76" w:name="rem-cantor-diagonal"/>
+    <w:bookmarkEnd w:id="75"/>
+    <w:bookmarkStart w:id="78" w:name="rem-cantor-diagonal"/>
     <w:p>
       <w:pPr>
         <w:pStyle w:val="BodyText"/>
@@ -16517,7 +16892,7 @@
       <w:r>
         <w:t xml:space="preserve"> </w:t>
       </w:r>
-      <w:hyperlink r:id="rId74">
+      <w:hyperlink r:id="rId76">
         <w:r>
           <w:rPr>
             <w:rStyle w:val="Hyperlink"/>
@@ -16647,7 +17022,7 @@
       <w:r>
         <w:t xml:space="preserve"> </w:t>
       </w:r>
-      <w:hyperlink r:id="rId75">
+      <w:hyperlink r:id="rId77">
         <w:r>
           <w:rPr>
             <w:rStyle w:val="Hyperlink"/>
@@ -16874,9 +17249,9 @@
         <w:t xml:space="preserve">and from the third in the third digit.</w:t>
       </w:r>
     </w:p>
-    <w:bookmarkEnd w:id="76"/>
-    <w:bookmarkEnd w:id="77"/>
-    <w:bookmarkStart w:id="82" w:name="extended-non-negative-real-numbers"/>
+    <w:bookmarkEnd w:id="78"/>
+    <w:bookmarkEnd w:id="79"/>
+    <w:bookmarkStart w:id="84" w:name="extended-non-negative-real-numbers"/>
     <w:p>
       <w:pPr>
         <w:pStyle w:val="Heading2"/>
@@ -16885,7 +17260,7 @@
         <w:t xml:space="preserve">5 Extended non-negative real numbers</w:t>
       </w:r>
     </w:p>
-    <w:bookmarkStart w:id="78" w:name="def-extended-nonneg-reals"/>
+    <w:bookmarkStart w:id="80" w:name="def-extended-nonneg-reals"/>
     <w:p>
       <w:pPr>
         <w:pStyle w:val="FirstParagraph"/>
@@ -16895,7 +17270,7 @@
           <w:b/>
           <w:bCs/>
         </w:rPr>
-        <w:t xml:space="preserve">Definition 24 (Extended non-negative real numbers)</w:t>
+        <w:t xml:space="preserve">Definition 25 (Extended non-negative real numbers)</w:t>
       </w:r>
       <w:r>
         <w:t xml:space="preserve"> </w:t>
@@ -17237,8 +17612,8 @@
         <w:t xml:space="preserve">.</w:t>
       </w:r>
     </w:p>
-    <w:bookmarkEnd w:id="78"/>
-    <w:bookmarkStart w:id="80" w:name="rem-infinity-arithmetic"/>
+    <w:bookmarkEnd w:id="80"/>
+    <w:bookmarkStart w:id="82" w:name="rem-infinity-arithmetic"/>
     <w:p>
       <w:pPr>
         <w:pStyle w:val="BodyText"/>
@@ -17442,7 +17817,7 @@
       <w:r>
         <w:t xml:space="preserve"> </w:t>
       </w:r>
-      <w:hyperlink r:id="rId79">
+      <w:hyperlink r:id="rId81">
         <w:r>
           <w:rPr>
             <w:rStyle w:val="Hyperlink"/>
@@ -17454,8 +17829,8 @@
         <w:t xml:space="preserve">).</w:t>
       </w:r>
     </w:p>
-    <w:bookmarkEnd w:id="80"/>
-    <w:bookmarkStart w:id="81" w:name="exm-extended-nonneg-reals"/>
+    <w:bookmarkEnd w:id="82"/>
+    <w:bookmarkStart w:id="83" w:name="exm-extended-nonneg-reals"/>
     <w:p>
       <w:pPr>
         <w:pStyle w:val="BodyText"/>
@@ -17465,7 +17840,7 @@
           <w:b/>
           <w:bCs/>
         </w:rPr>
-        <w:t xml:space="preserve">Example 17 (Adding with</w:t>
+        <w:t xml:space="preserve">Example 18 (Adding with</w:t>
       </w:r>
       <w:r>
         <w:rPr>
@@ -17645,9 +18020,9 @@
         <w:t xml:space="preserve">.</w:t>
       </w:r>
     </w:p>
-    <w:bookmarkEnd w:id="81"/>
-    <w:bookmarkEnd w:id="82"/>
-    <w:bookmarkStart w:id="83" w:name="sec-further-reading"/>
+    <w:bookmarkEnd w:id="83"/>
+    <w:bookmarkEnd w:id="84"/>
+    <w:bookmarkStart w:id="85" w:name="sec-further-reading"/>
     <w:p>
       <w:pPr>
         <w:pStyle w:val="Heading2"/>
@@ -17795,8 +18170,8 @@
         <w:t xml:space="preserve">.</w:t>
       </w:r>
     </w:p>
-    <w:bookmarkEnd w:id="83"/>
-    <w:bookmarkStart w:id="93" w:name="references"/>
+    <w:bookmarkEnd w:id="85"/>
+    <w:bookmarkStart w:id="95" w:name="references"/>
     <w:p>
       <w:pPr>
         <w:pStyle w:val="Heading2"/>
@@ -17805,8 +18180,8 @@
         <w:t xml:space="preserve">References</w:t>
       </w:r>
     </w:p>
-    <w:bookmarkStart w:id="92" w:name="refs"/>
-    <w:bookmarkStart w:id="85" w:name="ref-barkerplummer2011language"/>
+    <w:bookmarkStart w:id="94" w:name="refs"/>
+    <w:bookmarkStart w:id="87" w:name="ref-barkerplummer2011language"/>
     <w:p>
       <w:pPr>
         <w:pStyle w:val="Bibliography"/>
@@ -17830,7 +18205,7 @@
       <w:r>
         <w:t xml:space="preserve"> </w:t>
       </w:r>
-      <w:hyperlink r:id="rId84">
+      <w:hyperlink r:id="rId86">
         <w:r>
           <w:rPr>
             <w:rStyle w:val="Hyperlink"/>
@@ -17842,8 +18217,8 @@
         <w:t xml:space="preserve">.</w:t>
       </w:r>
     </w:p>
-    <w:bookmarkEnd w:id="85"/>
-    <w:bookmarkStart w:id="87" w:name="ref-devlin1993joy"/>
+    <w:bookmarkEnd w:id="87"/>
+    <w:bookmarkStart w:id="89" w:name="ref-devlin1993joy"/>
     <w:p>
       <w:pPr>
         <w:pStyle w:val="Bibliography"/>
@@ -17867,7 +18242,7 @@
       <w:r>
         <w:t xml:space="preserve"> </w:t>
       </w:r>
-      <w:hyperlink r:id="rId86">
+      <w:hyperlink r:id="rId88">
         <w:r>
           <w:rPr>
             <w:rStyle w:val="Hyperlink"/>
@@ -17879,8 +18254,8 @@
         <w:t xml:space="preserve">.</w:t>
       </w:r>
     </w:p>
-    <w:bookmarkEnd w:id="87"/>
-    <w:bookmarkStart w:id="89" w:name="ref-enderton2001logic"/>
+    <w:bookmarkEnd w:id="89"/>
+    <w:bookmarkStart w:id="91" w:name="ref-enderton2001logic"/>
     <w:p>
       <w:pPr>
         <w:pStyle w:val="Bibliography"/>
@@ -17904,7 +18279,7 @@
       <w:r>
         <w:t xml:space="preserve"> </w:t>
       </w:r>
-      <w:hyperlink r:id="rId88">
+      <w:hyperlink r:id="rId90">
         <w:r>
           <w:rPr>
             <w:rStyle w:val="Hyperlink"/>
@@ -17916,8 +18291,8 @@
         <w:t xml:space="preserve">.</w:t>
       </w:r>
     </w:p>
-    <w:bookmarkEnd w:id="89"/>
-    <w:bookmarkStart w:id="91" w:name="ref-halmos1974naive"/>
+    <w:bookmarkEnd w:id="91"/>
+    <w:bookmarkStart w:id="93" w:name="ref-halmos1974naive"/>
     <w:p>
       <w:pPr>
         <w:pStyle w:val="Bibliography"/>
@@ -17941,7 +18316,7 @@
       <w:r>
         <w:t xml:space="preserve"> </w:t>
       </w:r>
-      <w:hyperlink r:id="rId90">
+      <w:hyperlink r:id="rId92">
         <w:r>
           <w:rPr>
             <w:rStyle w:val="Hyperlink"/>
@@ -17953,9 +18328,9 @@
         <w:t xml:space="preserve">.</w:t>
       </w:r>
     </w:p>
-    <w:bookmarkEnd w:id="91"/>
-    <w:bookmarkEnd w:id="92"/>
     <w:bookmarkEnd w:id="93"/>
+    <w:bookmarkEnd w:id="94"/>
+    <w:bookmarkEnd w:id="95"/>
     <w:sectPr>
       <w:footnotePr>
         <w:numRestart w:val="eachSect"/>

</xml_diff>

<commit_message>
Deploying to gh-pages from @ Morrison-Lab/mds@6cf8a9e2e81b5125a92fa6afdd569e7af820be86 🚀
</commit_message>
<xml_diff>
--- a/sets-functions.docx
+++ b/sets-functions.docx
@@ -15,7 +15,7 @@
         <w:pStyle w:val="Date"/>
       </w:pPr>
       <w:r>
-        <w:t xml:space="preserve">Last modified: 2026-10-12 01:27:56 (PDT)</w:t>
+        <w:t xml:space="preserve">Last modified: 2026-10-12 19:40:12 (PDT)</w:t>
       </w:r>
     </w:p>
     <w:p>
@@ -14942,7 +14942,7 @@
     </w:p>
     <w:bookmarkEnd w:id="53"/>
     <w:bookmarkEnd w:id="54"/>
-    <w:bookmarkStart w:id="79" w:name="functions"/>
+    <w:bookmarkStart w:id="89" w:name="functions"/>
     <w:p>
       <w:pPr>
         <w:pStyle w:val="Heading2"/>
@@ -24517,8 +24517,2100 @@
       </w:r>
     </w:p>
     <w:bookmarkEnd w:id="78"/>
+    <w:bookmarkStart w:id="79" w:name="def-expression"/>
+    <w:p>
+      <w:pPr>
+        <w:pStyle w:val="FirstParagraph"/>
+      </w:pPr>
+      <w:r>
+        <w:rPr>
+          <w:b/>
+          <w:bCs/>
+        </w:rPr>
+        <w:t xml:space="preserve">Definition 26 (Expression)</w:t>
+      </w:r>
+      <w:r>
+        <w:t xml:space="preserve"> </w:t>
+      </w:r>
+      <w:r>
+        <w:t xml:space="preserve">An</w:t>
+      </w:r>
+      <w:r>
+        <w:t xml:space="preserve"> </w:t>
+      </w:r>
+      <w:r>
+        <w:rPr>
+          <w:b/>
+          <w:bCs/>
+        </w:rPr>
+        <w:t xml:space="preserve">expression</w:t>
+      </w:r>
+      <w:r>
+        <w:t xml:space="preserve"> </w:t>
+      </w:r>
+      <w:r>
+        <w:t xml:space="preserve">is a string of symbols, built from constants, variables,</w:t>
+      </w:r>
+      <w:r>
+        <w:t xml:space="preserve"> </w:t>
+      </w:r>
+      <w:r>
+        <w:t xml:space="preserve">operations and function names according to the rules of the notation.</w:t>
+      </w:r>
+      <w:r>
+        <w:t xml:space="preserve"> </w:t>
+      </w:r>
+      <w:r>
+        <w:t xml:space="preserve">When its variables are read as inputs,</w:t>
+      </w:r>
+      <w:r>
+        <w:t xml:space="preserve"> </w:t>
+      </w:r>
+      <w:r>
+        <w:t xml:space="preserve">an expression</w:t>
+      </w:r>
+      <w:r>
+        <w:t xml:space="preserve"> </w:t>
+      </w:r>
+      <w:r>
+        <w:rPr>
+          <w:i/>
+          <w:iCs/>
+        </w:rPr>
+        <w:t xml:space="preserve">denotes</w:t>
+      </w:r>
+      <w:r>
+        <w:t xml:space="preserve"> </w:t>
+      </w:r>
+      <w:r>
+        <w:t xml:space="preserve">a</w:t>
+      </w:r>
+      <w:r>
+        <w:t xml:space="preserve"> </w:t>
+      </w:r>
+      <w:hyperlink w:anchor="def-function">
+        <w:r>
+          <w:rPr>
+            <w:rStyle w:val="Hyperlink"/>
+          </w:rPr>
+          <w:t xml:space="preserve">function</w:t>
+        </w:r>
+      </w:hyperlink>
+      <w:r>
+        <w:t xml:space="preserve">:</w:t>
+      </w:r>
+      <w:r>
+        <w:t xml:space="preserve"> </w:t>
+      </w:r>
+      <w:r>
+        <w:t xml:space="preserve">it fixes the output for each input.</w:t>
+      </w:r>
+    </w:p>
     <w:bookmarkEnd w:id="79"/>
-    <w:bookmarkStart w:id="94" w:name="countable-sets"/>
+    <w:bookmarkStart w:id="80" w:name="exm-expression"/>
+    <w:p>
+      <w:pPr>
+        <w:pStyle w:val="BodyText"/>
+      </w:pPr>
+      <w:r>
+        <w:rPr>
+          <w:b/>
+          <w:bCs/>
+        </w:rPr>
+        <w:t xml:space="preserve">Example 22 (Two expressions for one function)</w:t>
+      </w:r>
+      <w:r>
+        <w:t xml:space="preserve"> </w:t>
+      </w:r>
+      <w:r>
+        <w:t xml:space="preserve">The expressions</w:t>
+      </w:r>
+      <w:r>
+        <w:t xml:space="preserve"> </w:t>
+      </w:r>
+      <m:oMath>
+        <m:r>
+          <m:t>a</m:t>
+        </m:r>
+        <m:sSup>
+          <m:e>
+            <m:r>
+              <m:t>x</m:t>
+            </m:r>
+          </m:e>
+          <m:sup>
+            <m:r>
+              <m:t>2</m:t>
+            </m:r>
+          </m:sup>
+        </m:sSup>
+        <m:r>
+          <m:rPr>
+            <m:sty m:val="p"/>
+          </m:rPr>
+          <m:t>+</m:t>
+        </m:r>
+        <m:r>
+          <m:t>b</m:t>
+        </m:r>
+        <m:r>
+          <m:t>x</m:t>
+        </m:r>
+        <m:r>
+          <m:rPr>
+            <m:sty m:val="p"/>
+          </m:rPr>
+          <m:t>+</m:t>
+        </m:r>
+        <m:r>
+          <m:t>c</m:t>
+        </m:r>
+      </m:oMath>
+      <w:r>
+        <w:t xml:space="preserve"> </w:t>
+      </w:r>
+      <w:r>
+        <w:t xml:space="preserve">and</w:t>
+      </w:r>
+      <w:r>
+        <w:t xml:space="preserve"> </w:t>
+      </w:r>
+      <m:oMath>
+        <m:r>
+          <m:rPr>
+            <m:sty m:val="p"/>
+          </m:rPr>
+          <m:t>(</m:t>
+        </m:r>
+        <m:r>
+          <m:t>a</m:t>
+        </m:r>
+        <m:r>
+          <m:t>x</m:t>
+        </m:r>
+        <m:r>
+          <m:rPr>
+            <m:sty m:val="p"/>
+          </m:rPr>
+          <m:t>+</m:t>
+        </m:r>
+        <m:r>
+          <m:t>b</m:t>
+        </m:r>
+        <m:r>
+          <m:rPr>
+            <m:sty m:val="p"/>
+          </m:rPr>
+          <m:t>)</m:t>
+        </m:r>
+        <m:r>
+          <m:t> </m:t>
+        </m:r>
+        <m:r>
+          <m:t>x</m:t>
+        </m:r>
+        <m:r>
+          <m:rPr>
+            <m:sty m:val="p"/>
+          </m:rPr>
+          <m:t>+</m:t>
+        </m:r>
+        <m:r>
+          <m:t>c</m:t>
+        </m:r>
+      </m:oMath>
+      <w:r>
+        <w:t xml:space="preserve"> </w:t>
+      </w:r>
+      <w:r>
+        <w:t xml:space="preserve">denote the same function of</w:t>
+      </w:r>
+      <w:r>
+        <w:t xml:space="preserve"> </w:t>
+      </w:r>
+      <m:oMath>
+        <m:r>
+          <m:t>x</m:t>
+        </m:r>
+      </m:oMath>
+      <w:r>
+        <w:t xml:space="preserve"> </w:t>
+      </w:r>
+      <w:r>
+        <w:t xml:space="preserve">for any fixed</w:t>
+      </w:r>
+      <w:r>
+        <w:t xml:space="preserve"> </w:t>
+      </w:r>
+      <m:oMath>
+        <m:r>
+          <m:t>a</m:t>
+        </m:r>
+      </m:oMath>
+      <w:r>
+        <w:t xml:space="preserve">,</w:t>
+      </w:r>
+      <w:r>
+        <w:t xml:space="preserve"> </w:t>
+      </w:r>
+      <m:oMath>
+        <m:r>
+          <m:t>b</m:t>
+        </m:r>
+      </m:oMath>
+      <w:r>
+        <w:t xml:space="preserve"> </w:t>
+      </w:r>
+      <w:r>
+        <w:t xml:space="preserve">and</w:t>
+      </w:r>
+      <w:r>
+        <w:t xml:space="preserve"> </w:t>
+      </w:r>
+      <m:oMath>
+        <m:r>
+          <m:t>c</m:t>
+        </m:r>
+      </m:oMath>
+      <w:r>
+        <w:t xml:space="preserve">,</w:t>
+      </w:r>
+      <w:r>
+        <w:t xml:space="preserve"> </w:t>
+      </w:r>
+      <w:r>
+        <w:t xml:space="preserve">because they give the same value at every</w:t>
+      </w:r>
+      <w:r>
+        <w:t xml:space="preserve"> </w:t>
+      </w:r>
+      <m:oMath>
+        <m:r>
+          <m:t>x</m:t>
+        </m:r>
+      </m:oMath>
+      <w:r>
+        <w:t xml:space="preserve">.</w:t>
+      </w:r>
+    </w:p>
+    <w:p>
+      <w:pPr>
+        <w:pStyle w:val="BodyText"/>
+      </w:pPr>
+      <w:r>
+        <w:t xml:space="preserve">Precedence parses</w:t>
+      </w:r>
+      <w:r>
+        <w:t xml:space="preserve"> </w:t>
+      </w:r>
+      <m:oMath>
+        <m:r>
+          <m:t>a</m:t>
+        </m:r>
+        <m:sSup>
+          <m:e>
+            <m:r>
+              <m:t>x</m:t>
+            </m:r>
+          </m:e>
+          <m:sup>
+            <m:r>
+              <m:t>2</m:t>
+            </m:r>
+          </m:sup>
+        </m:sSup>
+        <m:r>
+          <m:rPr>
+            <m:sty m:val="p"/>
+          </m:rPr>
+          <m:t>+</m:t>
+        </m:r>
+        <m:r>
+          <m:t>b</m:t>
+        </m:r>
+        <m:r>
+          <m:t>x</m:t>
+        </m:r>
+        <m:r>
+          <m:rPr>
+            <m:sty m:val="p"/>
+          </m:rPr>
+          <m:t>+</m:t>
+        </m:r>
+        <m:r>
+          <m:t>c</m:t>
+        </m:r>
+      </m:oMath>
+      <w:r>
+        <w:t xml:space="preserve"> </w:t>
+      </w:r>
+      <w:r>
+        <w:t xml:space="preserve">as a sum of three terms:</w:t>
+      </w:r>
+      <w:r>
+        <w:t xml:space="preserve"> </w:t>
+      </w:r>
+      <w:r>
+        <w:t xml:space="preserve">the power</w:t>
+      </w:r>
+      <w:r>
+        <w:t xml:space="preserve"> </w:t>
+      </w:r>
+      <m:oMath>
+        <m:sSup>
+          <m:e>
+            <m:r>
+              <m:t>x</m:t>
+            </m:r>
+          </m:e>
+          <m:sup>
+            <m:r>
+              <m:t>2</m:t>
+            </m:r>
+          </m:sup>
+        </m:sSup>
+      </m:oMath>
+      <w:r>
+        <w:t xml:space="preserve"> </w:t>
+      </w:r>
+      <w:r>
+        <w:t xml:space="preserve">is applied first,</w:t>
+      </w:r>
+      <w:r>
+        <w:t xml:space="preserve"> </w:t>
+      </w:r>
+      <w:r>
+        <w:t xml:space="preserve">then</w:t>
+      </w:r>
+      <w:r>
+        <w:t xml:space="preserve"> </w:t>
+      </w:r>
+      <m:oMath>
+        <m:r>
+          <m:t>a</m:t>
+        </m:r>
+      </m:oMath>
+      <w:r>
+        <w:t xml:space="preserve"> </w:t>
+      </w:r>
+      <w:r>
+        <w:t xml:space="preserve">multiplies</w:t>
+      </w:r>
+      <w:r>
+        <w:t xml:space="preserve"> </w:t>
+      </w:r>
+      <m:oMath>
+        <m:sSup>
+          <m:e>
+            <m:r>
+              <m:t>x</m:t>
+            </m:r>
+          </m:e>
+          <m:sup>
+            <m:r>
+              <m:t>2</m:t>
+            </m:r>
+          </m:sup>
+        </m:sSup>
+      </m:oMath>
+      <w:r>
+        <w:t xml:space="preserve"> </w:t>
+      </w:r>
+      <w:r>
+        <w:t xml:space="preserve">and</w:t>
+      </w:r>
+      <w:r>
+        <w:t xml:space="preserve"> </w:t>
+      </w:r>
+      <m:oMath>
+        <m:r>
+          <m:t>b</m:t>
+        </m:r>
+      </m:oMath>
+      <w:r>
+        <w:t xml:space="preserve"> </w:t>
+      </w:r>
+      <w:r>
+        <w:t xml:space="preserve">multiplies</w:t>
+      </w:r>
+      <w:r>
+        <w:t xml:space="preserve"> </w:t>
+      </w:r>
+      <m:oMath>
+        <m:r>
+          <m:t>x</m:t>
+        </m:r>
+      </m:oMath>
+      <w:r>
+        <w:t xml:space="preserve">,</w:t>
+      </w:r>
+      <w:r>
+        <w:t xml:space="preserve"> </w:t>
+      </w:r>
+      <w:r>
+        <w:t xml:space="preserve">and the three products are added.</w:t>
+      </w:r>
+      <w:r>
+        <w:t xml:space="preserve"> </w:t>
+      </w:r>
+      <w:r>
+        <w:t xml:space="preserve">The parentheses in</w:t>
+      </w:r>
+      <w:r>
+        <w:t xml:space="preserve"> </w:t>
+      </w:r>
+      <m:oMath>
+        <m:r>
+          <m:rPr>
+            <m:sty m:val="p"/>
+          </m:rPr>
+          <m:t>(</m:t>
+        </m:r>
+        <m:r>
+          <m:t>a</m:t>
+        </m:r>
+        <m:r>
+          <m:t>x</m:t>
+        </m:r>
+        <m:r>
+          <m:rPr>
+            <m:sty m:val="p"/>
+          </m:rPr>
+          <m:t>+</m:t>
+        </m:r>
+        <m:r>
+          <m:t>b</m:t>
+        </m:r>
+        <m:r>
+          <m:rPr>
+            <m:sty m:val="p"/>
+          </m:rPr>
+          <m:t>)</m:t>
+        </m:r>
+        <m:r>
+          <m:t> </m:t>
+        </m:r>
+        <m:r>
+          <m:t>x</m:t>
+        </m:r>
+        <m:r>
+          <m:rPr>
+            <m:sty m:val="p"/>
+          </m:rPr>
+          <m:t>+</m:t>
+        </m:r>
+        <m:r>
+          <m:t>c</m:t>
+        </m:r>
+      </m:oMath>
+      <w:r>
+        <w:t xml:space="preserve"> </w:t>
+      </w:r>
+      <w:r>
+        <w:t xml:space="preserve">force a different tree:</w:t>
+      </w:r>
+      <w:r>
+        <w:t xml:space="preserve"> </w:t>
+      </w:r>
+      <m:oMath>
+        <m:r>
+          <m:t>a</m:t>
+        </m:r>
+      </m:oMath>
+      <w:r>
+        <w:t xml:space="preserve"> </w:t>
+      </w:r>
+      <w:r>
+        <w:t xml:space="preserve">multiplies</w:t>
+      </w:r>
+      <w:r>
+        <w:t xml:space="preserve"> </w:t>
+      </w:r>
+      <m:oMath>
+        <m:r>
+          <m:t>x</m:t>
+        </m:r>
+      </m:oMath>
+      <w:r>
+        <w:t xml:space="preserve">,</w:t>
+      </w:r>
+      <w:r>
+        <w:t xml:space="preserve"> </w:t>
+      </w:r>
+      <m:oMath>
+        <m:r>
+          <m:t>b</m:t>
+        </m:r>
+      </m:oMath>
+      <w:r>
+        <w:t xml:space="preserve"> </w:t>
+      </w:r>
+      <w:r>
+        <w:t xml:space="preserve">is added, the sum multiplies</w:t>
+      </w:r>
+      <w:r>
+        <w:t xml:space="preserve"> </w:t>
+      </w:r>
+      <m:oMath>
+        <m:r>
+          <m:t>x</m:t>
+        </m:r>
+      </m:oMath>
+      <w:r>
+        <w:t xml:space="preserve">,</w:t>
+      </w:r>
+      <w:r>
+        <w:t xml:space="preserve"> </w:t>
+      </w:r>
+      <w:r>
+        <w:t xml:space="preserve">and</w:t>
+      </w:r>
+      <w:r>
+        <w:t xml:space="preserve"> </w:t>
+      </w:r>
+      <m:oMath>
+        <m:r>
+          <m:t>c</m:t>
+        </m:r>
+      </m:oMath>
+      <w:r>
+        <w:t xml:space="preserve"> </w:t>
+      </w:r>
+      <w:r>
+        <w:t xml:space="preserve">is added.</w:t>
+      </w:r>
+    </w:p>
+    <w:bookmarkEnd w:id="80"/>
+    <w:bookmarkStart w:id="81" w:name="def-parse-tree"/>
+    <w:p>
+      <w:pPr>
+        <w:pStyle w:val="BodyText"/>
+      </w:pPr>
+      <w:r>
+        <w:rPr>
+          <w:b/>
+          <w:bCs/>
+        </w:rPr>
+        <w:t xml:space="preserve">Definition 27 (Parse tree)</w:t>
+      </w:r>
+      <w:r>
+        <w:t xml:space="preserve"> </w:t>
+      </w:r>
+      <w:r>
+        <w:t xml:space="preserve">The</w:t>
+      </w:r>
+      <w:r>
+        <w:t xml:space="preserve"> </w:t>
+      </w:r>
+      <w:r>
+        <w:rPr>
+          <w:b/>
+          <w:bCs/>
+        </w:rPr>
+        <w:t xml:space="preserve">parse tree</w:t>
+      </w:r>
+      <w:r>
+        <w:t xml:space="preserve"> </w:t>
+      </w:r>
+      <w:r>
+        <w:t xml:space="preserve">of an</w:t>
+      </w:r>
+      <w:r>
+        <w:t xml:space="preserve"> </w:t>
+      </w:r>
+      <w:hyperlink w:anchor="def-expression">
+        <w:r>
+          <w:rPr>
+            <w:rStyle w:val="Hyperlink"/>
+          </w:rPr>
+          <w:t xml:space="preserve">expression</w:t>
+        </w:r>
+      </w:hyperlink>
+      <w:r>
+        <w:t xml:space="preserve"> </w:t>
+      </w:r>
+      <w:r>
+        <w:t xml:space="preserve">is the tree</w:t>
+      </w:r>
+      <w:r>
+        <w:t xml:space="preserve"> </w:t>
+      </w:r>
+      <w:r>
+        <w:t xml:space="preserve">that shows how its symbols group into operations.</w:t>
+      </w:r>
+      <w:r>
+        <w:t xml:space="preserve"> </w:t>
+      </w:r>
+      <w:r>
+        <w:t xml:space="preserve">Its leaves are the constants and variables of the expression,</w:t>
+      </w:r>
+      <w:r>
+        <w:t xml:space="preserve"> </w:t>
+      </w:r>
+      <w:r>
+        <w:t xml:space="preserve">and each internal node is an operation applied to the nodes below it.</w:t>
+      </w:r>
+    </w:p>
+    <w:bookmarkEnd w:id="81"/>
+    <w:bookmarkStart w:id="82" w:name="exm-parse-tree"/>
+    <w:p>
+      <w:pPr>
+        <w:pStyle w:val="BodyText"/>
+      </w:pPr>
+      <w:r>
+        <w:rPr>
+          <w:b/>
+          <w:bCs/>
+        </w:rPr>
+        <w:t xml:space="preserve">Example 23 (The parse tree of a polynomial)</w:t>
+      </w:r>
+      <w:r>
+        <w:t xml:space="preserve"> </w:t>
+      </w:r>
+      <w:r>
+        <w:t xml:space="preserve">The parse tree of</w:t>
+      </w:r>
+      <w:r>
+        <w:t xml:space="preserve"> </w:t>
+      </w:r>
+      <m:oMath>
+        <m:r>
+          <m:rPr>
+            <m:sty m:val="p"/>
+          </m:rPr>
+          <m:t>(</m:t>
+        </m:r>
+        <m:r>
+          <m:t>a</m:t>
+        </m:r>
+        <m:r>
+          <m:t>x</m:t>
+        </m:r>
+        <m:r>
+          <m:rPr>
+            <m:sty m:val="p"/>
+          </m:rPr>
+          <m:t>+</m:t>
+        </m:r>
+        <m:r>
+          <m:t>b</m:t>
+        </m:r>
+        <m:r>
+          <m:rPr>
+            <m:sty m:val="p"/>
+          </m:rPr>
+          <m:t>)</m:t>
+        </m:r>
+        <m:r>
+          <m:t> </m:t>
+        </m:r>
+        <m:r>
+          <m:t>x</m:t>
+        </m:r>
+        <m:r>
+          <m:rPr>
+            <m:sty m:val="p"/>
+          </m:rPr>
+          <m:t>+</m:t>
+        </m:r>
+        <m:r>
+          <m:t>c</m:t>
+        </m:r>
+      </m:oMath>
+      <w:r>
+        <w:t xml:space="preserve">, with each operation having two children, is:</w:t>
+      </w:r>
+    </w:p>
+    <w:p>
+      <w:pPr>
+        <w:pStyle w:val="Compact"/>
+        <w:numPr>
+          <w:ilvl w:val="0"/>
+          <w:numId w:val="1019"/>
+        </w:numPr>
+      </w:pPr>
+      <w:r>
+        <w:t xml:space="preserve">the root</w:t>
+      </w:r>
+      <w:r>
+        <w:t xml:space="preserve"> </w:t>
+      </w:r>
+      <m:oMath>
+        <m:r>
+          <m:rPr>
+            <m:sty m:val="p"/>
+          </m:rPr>
+          <m:t>+</m:t>
+        </m:r>
+      </m:oMath>
+      <w:r>
+        <w:t xml:space="preserve">, whose children are</w:t>
+      </w:r>
+    </w:p>
+    <w:p>
+      <w:pPr>
+        <w:pStyle w:val="Compact"/>
+        <w:numPr>
+          <w:ilvl w:val="1"/>
+          <w:numId w:val="1020"/>
+        </w:numPr>
+      </w:pPr>
+      <w:r>
+        <w:t xml:space="preserve">the node</w:t>
+      </w:r>
+      <w:r>
+        <w:t xml:space="preserve"> </w:t>
+      </w:r>
+      <m:oMath>
+        <m:r>
+          <m:rPr>
+            <m:sty m:val="p"/>
+          </m:rPr>
+          <m:t>×</m:t>
+        </m:r>
+      </m:oMath>
+      <w:r>
+        <w:t xml:space="preserve">, whose children are</w:t>
+      </w:r>
+    </w:p>
+    <w:p>
+      <w:pPr>
+        <w:pStyle w:val="Compact"/>
+        <w:numPr>
+          <w:ilvl w:val="2"/>
+          <w:numId w:val="1021"/>
+        </w:numPr>
+      </w:pPr>
+      <w:r>
+        <w:t xml:space="preserve">the node</w:t>
+      </w:r>
+      <w:r>
+        <w:t xml:space="preserve"> </w:t>
+      </w:r>
+      <m:oMath>
+        <m:r>
+          <m:rPr>
+            <m:sty m:val="p"/>
+          </m:rPr>
+          <m:t>+</m:t>
+        </m:r>
+      </m:oMath>
+      <w:r>
+        <w:t xml:space="preserve">, whose children are</w:t>
+      </w:r>
+    </w:p>
+    <w:p>
+      <w:pPr>
+        <w:pStyle w:val="Compact"/>
+        <w:numPr>
+          <w:ilvl w:val="3"/>
+          <w:numId w:val="1022"/>
+        </w:numPr>
+      </w:pPr>
+      <w:r>
+        <w:t xml:space="preserve">the node</w:t>
+      </w:r>
+      <w:r>
+        <w:t xml:space="preserve"> </w:t>
+      </w:r>
+      <m:oMath>
+        <m:r>
+          <m:rPr>
+            <m:sty m:val="p"/>
+          </m:rPr>
+          <m:t>×</m:t>
+        </m:r>
+      </m:oMath>
+      <w:r>
+        <w:t xml:space="preserve">, whose children are the leaves</w:t>
+      </w:r>
+      <w:r>
+        <w:t xml:space="preserve"> </w:t>
+      </w:r>
+      <m:oMath>
+        <m:r>
+          <m:t>a</m:t>
+        </m:r>
+      </m:oMath>
+      <w:r>
+        <w:t xml:space="preserve"> </w:t>
+      </w:r>
+      <w:r>
+        <w:t xml:space="preserve">and</w:t>
+      </w:r>
+      <w:r>
+        <w:t xml:space="preserve"> </w:t>
+      </w:r>
+      <m:oMath>
+        <m:r>
+          <m:t>x</m:t>
+        </m:r>
+      </m:oMath>
+      <w:r>
+        <w:t xml:space="preserve">,</w:t>
+      </w:r>
+    </w:p>
+    <w:p>
+      <w:pPr>
+        <w:pStyle w:val="Compact"/>
+        <w:numPr>
+          <w:ilvl w:val="3"/>
+          <w:numId w:val="1022"/>
+        </w:numPr>
+      </w:pPr>
+      <w:r>
+        <w:t xml:space="preserve">the leaf</w:t>
+      </w:r>
+      <w:r>
+        <w:t xml:space="preserve"> </w:t>
+      </w:r>
+      <m:oMath>
+        <m:r>
+          <m:t>b</m:t>
+        </m:r>
+      </m:oMath>
+      <w:r>
+        <w:t xml:space="preserve">;</w:t>
+      </w:r>
+    </w:p>
+    <w:p>
+      <w:pPr>
+        <w:pStyle w:val="Compact"/>
+        <w:numPr>
+          <w:ilvl w:val="2"/>
+          <w:numId w:val="1021"/>
+        </w:numPr>
+      </w:pPr>
+      <w:r>
+        <w:t xml:space="preserve">the leaf</w:t>
+      </w:r>
+      <w:r>
+        <w:t xml:space="preserve"> </w:t>
+      </w:r>
+      <m:oMath>
+        <m:r>
+          <m:t>x</m:t>
+        </m:r>
+      </m:oMath>
+      <w:r>
+        <w:t xml:space="preserve">;</w:t>
+      </w:r>
+    </w:p>
+    <w:p>
+      <w:pPr>
+        <w:pStyle w:val="Compact"/>
+        <w:numPr>
+          <w:ilvl w:val="1"/>
+          <w:numId w:val="1020"/>
+        </w:numPr>
+      </w:pPr>
+      <w:r>
+        <w:t xml:space="preserve">the leaf</w:t>
+      </w:r>
+      <w:r>
+        <w:t xml:space="preserve"> </w:t>
+      </w:r>
+      <m:oMath>
+        <m:r>
+          <m:t>c</m:t>
+        </m:r>
+      </m:oMath>
+      <w:r>
+        <w:t xml:space="preserve">.</w:t>
+      </w:r>
+    </w:p>
+    <w:p>
+      <w:pPr>
+        <w:pStyle w:val="FirstParagraph"/>
+      </w:pPr>
+      <w:r>
+        <w:t xml:space="preserve">Read from the leaves up, the tree says to multiply</w:t>
+      </w:r>
+      <w:r>
+        <w:t xml:space="preserve"> </w:t>
+      </w:r>
+      <m:oMath>
+        <m:r>
+          <m:t>a</m:t>
+        </m:r>
+      </m:oMath>
+      <w:r>
+        <w:t xml:space="preserve"> </w:t>
+      </w:r>
+      <w:r>
+        <w:t xml:space="preserve">by</w:t>
+      </w:r>
+      <w:r>
+        <w:t xml:space="preserve"> </w:t>
+      </w:r>
+      <m:oMath>
+        <m:r>
+          <m:t>x</m:t>
+        </m:r>
+      </m:oMath>
+      <w:r>
+        <w:t xml:space="preserve">,</w:t>
+      </w:r>
+      <w:r>
+        <w:t xml:space="preserve"> </w:t>
+      </w:r>
+      <w:r>
+        <w:t xml:space="preserve">add</w:t>
+      </w:r>
+      <w:r>
+        <w:t xml:space="preserve"> </w:t>
+      </w:r>
+      <m:oMath>
+        <m:r>
+          <m:t>b</m:t>
+        </m:r>
+      </m:oMath>
+      <w:r>
+        <w:t xml:space="preserve">, multiply by</w:t>
+      </w:r>
+      <w:r>
+        <w:t xml:space="preserve"> </w:t>
+      </w:r>
+      <m:oMath>
+        <m:r>
+          <m:t>x</m:t>
+        </m:r>
+      </m:oMath>
+      <w:r>
+        <w:t xml:space="preserve">, and add</w:t>
+      </w:r>
+      <w:r>
+        <w:t xml:space="preserve"> </w:t>
+      </w:r>
+      <m:oMath>
+        <m:r>
+          <m:t>c</m:t>
+        </m:r>
+      </m:oMath>
+      <w:r>
+        <w:t xml:space="preserve">.</w:t>
+      </w:r>
+      <w:r>
+        <w:t xml:space="preserve"> </w:t>
+      </w:r>
+      <w:r>
+        <w:t xml:space="preserve">The expression</w:t>
+      </w:r>
+      <w:r>
+        <w:t xml:space="preserve"> </w:t>
+      </w:r>
+      <m:oMath>
+        <m:r>
+          <m:t>a</m:t>
+        </m:r>
+        <m:sSup>
+          <m:e>
+            <m:r>
+              <m:t>x</m:t>
+            </m:r>
+          </m:e>
+          <m:sup>
+            <m:r>
+              <m:t>2</m:t>
+            </m:r>
+          </m:sup>
+        </m:sSup>
+        <m:r>
+          <m:rPr>
+            <m:sty m:val="p"/>
+          </m:rPr>
+          <m:t>+</m:t>
+        </m:r>
+        <m:r>
+          <m:t>b</m:t>
+        </m:r>
+        <m:r>
+          <m:t>x</m:t>
+        </m:r>
+        <m:r>
+          <m:rPr>
+            <m:sty m:val="p"/>
+          </m:rPr>
+          <m:t>+</m:t>
+        </m:r>
+        <m:r>
+          <m:t>c</m:t>
+        </m:r>
+      </m:oMath>
+      <w:r>
+        <w:t xml:space="preserve"> </w:t>
+      </w:r>
+      <w:r>
+        <w:t xml:space="preserve">has a different tree.</w:t>
+      </w:r>
+      <w:r>
+        <w:t xml:space="preserve"> </w:t>
+      </w:r>
+      <w:r>
+        <w:t xml:space="preserve">Its root is the</w:t>
+      </w:r>
+      <w:r>
+        <w:t xml:space="preserve"> </w:t>
+      </w:r>
+      <m:oMath>
+        <m:r>
+          <m:rPr>
+            <m:sty m:val="p"/>
+          </m:rPr>
+          <m:t>+</m:t>
+        </m:r>
+      </m:oMath>
+      <w:r>
+        <w:t xml:space="preserve"> </w:t>
+      </w:r>
+      <w:r>
+        <w:t xml:space="preserve">whose children are</w:t>
+      </w:r>
+      <w:r>
+        <w:t xml:space="preserve"> </w:t>
+      </w:r>
+      <m:oMath>
+        <m:r>
+          <m:t>a</m:t>
+        </m:r>
+        <m:sSup>
+          <m:e>
+            <m:r>
+              <m:t>x</m:t>
+            </m:r>
+          </m:e>
+          <m:sup>
+            <m:r>
+              <m:t>2</m:t>
+            </m:r>
+          </m:sup>
+        </m:sSup>
+        <m:r>
+          <m:rPr>
+            <m:sty m:val="p"/>
+          </m:rPr>
+          <m:t>+</m:t>
+        </m:r>
+        <m:r>
+          <m:t>b</m:t>
+        </m:r>
+        <m:r>
+          <m:t>x</m:t>
+        </m:r>
+      </m:oMath>
+      <w:r>
+        <w:t xml:space="preserve"> </w:t>
+      </w:r>
+      <w:r>
+        <w:t xml:space="preserve">and</w:t>
+      </w:r>
+      <w:r>
+        <w:t xml:space="preserve"> </w:t>
+      </w:r>
+      <m:oMath>
+        <m:r>
+          <m:t>c</m:t>
+        </m:r>
+      </m:oMath>
+      <w:r>
+        <w:t xml:space="preserve">,</w:t>
+      </w:r>
+      <w:r>
+        <w:t xml:space="preserve"> </w:t>
+      </w:r>
+      <w:r>
+        <w:t xml:space="preserve">and the first of these is a</w:t>
+      </w:r>
+      <w:r>
+        <w:t xml:space="preserve"> </w:t>
+      </w:r>
+      <m:oMath>
+        <m:r>
+          <m:rPr>
+            <m:sty m:val="p"/>
+          </m:rPr>
+          <m:t>+</m:t>
+        </m:r>
+      </m:oMath>
+      <w:r>
+        <w:t xml:space="preserve"> </w:t>
+      </w:r>
+      <w:r>
+        <w:t xml:space="preserve">whose children are</w:t>
+      </w:r>
+      <w:r>
+        <w:t xml:space="preserve"> </w:t>
+      </w:r>
+      <m:oMath>
+        <m:r>
+          <m:t>a</m:t>
+        </m:r>
+        <m:sSup>
+          <m:e>
+            <m:r>
+              <m:t>x</m:t>
+            </m:r>
+          </m:e>
+          <m:sup>
+            <m:r>
+              <m:t>2</m:t>
+            </m:r>
+          </m:sup>
+        </m:sSup>
+      </m:oMath>
+      <w:r>
+        <w:t xml:space="preserve"> </w:t>
+      </w:r>
+      <w:r>
+        <w:t xml:space="preserve">and</w:t>
+      </w:r>
+      <w:r>
+        <w:t xml:space="preserve"> </w:t>
+      </w:r>
+      <m:oMath>
+        <m:r>
+          <m:t>b</m:t>
+        </m:r>
+        <m:r>
+          <m:t>x</m:t>
+        </m:r>
+      </m:oMath>
+      <w:r>
+        <w:t xml:space="preserve">.</w:t>
+      </w:r>
+    </w:p>
+    <w:bookmarkEnd w:id="82"/>
+    <w:bookmarkStart w:id="83" w:name="rem-expression-parse-tree"/>
+    <w:p>
+      <w:pPr>
+        <w:pStyle w:val="BodyText"/>
+      </w:pPr>
+      <w:r>
+        <w:rPr>
+          <w:i/>
+          <w:iCs/>
+        </w:rPr>
+        <w:t xml:space="preserve">Remark 9</w:t>
+      </w:r>
+      <w:r>
+        <w:t xml:space="preserve"> (Expressions, precedence and parse trees). </w:t>
+      </w:r>
+      <w:r>
+        <w:t xml:space="preserve">An expression does not say how to compute the output it fixes,</w:t>
+      </w:r>
+      <w:r>
+        <w:t xml:space="preserve"> </w:t>
+      </w:r>
+      <w:r>
+        <w:t xml:space="preserve">and many expressions denote the same function.</w:t>
+      </w:r>
+      <w:r>
+        <w:t xml:space="preserve"> </w:t>
+      </w:r>
+      <w:r>
+        <w:t xml:space="preserve">A function is the input-output relationship itself;</w:t>
+      </w:r>
+      <w:r>
+        <w:t xml:space="preserve"> </w:t>
+      </w:r>
+      <w:r>
+        <w:t xml:space="preserve">an expression is one way of writing it down.</w:t>
+      </w:r>
+    </w:p>
+    <w:p>
+      <w:pPr>
+        <w:pStyle w:val="BodyText"/>
+      </w:pPr>
+      <w:r>
+        <w:t xml:space="preserve">The rules of operator precedence (PEMDAS: parentheses, exponents,</w:t>
+      </w:r>
+      <w:r>
+        <w:t xml:space="preserve"> </w:t>
+      </w:r>
+      <w:r>
+        <w:t xml:space="preserve">multiplication and division, addition and subtraction)</w:t>
+      </w:r>
+      <w:r>
+        <w:t xml:space="preserve"> </w:t>
+      </w:r>
+      <w:r>
+        <w:t xml:space="preserve">decide how the symbols group.</w:t>
+      </w:r>
+      <w:r>
+        <w:t xml:space="preserve"> </w:t>
+      </w:r>
+      <w:r>
+        <w:t xml:space="preserve">They turn the string into its parse tree (</w:t>
+      </w:r>
+      <w:hyperlink w:anchor="def-parse-tree">
+        <w:r>
+          <w:rPr>
+            <w:rStyle w:val="Hyperlink"/>
+          </w:rPr>
+          <w:t xml:space="preserve">Definition 27</w:t>
+        </w:r>
+      </w:hyperlink>
+      <w:r>
+        <w:t xml:space="preserve">).</w:t>
+      </w:r>
+    </w:p>
+    <w:bookmarkEnd w:id="83"/>
+    <w:bookmarkStart w:id="84" w:name="def-algorithm"/>
+    <w:p>
+      <w:pPr>
+        <w:pStyle w:val="BodyText"/>
+      </w:pPr>
+      <w:r>
+        <w:rPr>
+          <w:b/>
+          <w:bCs/>
+        </w:rPr>
+        <w:t xml:space="preserve">Definition 28 (Algorithm)</w:t>
+      </w:r>
+      <w:r>
+        <w:t xml:space="preserve"> </w:t>
+      </w:r>
+      <w:r>
+        <w:t xml:space="preserve">An</w:t>
+      </w:r>
+      <w:r>
+        <w:t xml:space="preserve"> </w:t>
+      </w:r>
+      <w:r>
+        <w:rPr>
+          <w:b/>
+          <w:bCs/>
+        </w:rPr>
+        <w:t xml:space="preserve">algorithm</w:t>
+      </w:r>
+      <w:r>
+        <w:t xml:space="preserve"> </w:t>
+      </w:r>
+      <w:r>
+        <w:t xml:space="preserve">is a finite list of unambiguous steps that,</w:t>
+      </w:r>
+      <w:r>
+        <w:t xml:space="preserve"> </w:t>
+      </w:r>
+      <w:r>
+        <w:t xml:space="preserve">applied to any valid input, halts and returns an output.</w:t>
+      </w:r>
+      <w:r>
+        <w:t xml:space="preserve"> </w:t>
+      </w:r>
+      <w:r>
+        <w:t xml:space="preserve">An algorithm</w:t>
+      </w:r>
+      <w:r>
+        <w:t xml:space="preserve"> </w:t>
+      </w:r>
+      <w:r>
+        <w:rPr>
+          <w:i/>
+          <w:iCs/>
+        </w:rPr>
+        <w:t xml:space="preserve">computes</w:t>
+      </w:r>
+      <w:r>
+        <w:t xml:space="preserve"> </w:t>
+      </w:r>
+      <w:r>
+        <w:t xml:space="preserve">a</w:t>
+      </w:r>
+      <w:r>
+        <w:t xml:space="preserve"> </w:t>
+      </w:r>
+      <w:hyperlink w:anchor="def-function">
+        <w:r>
+          <w:rPr>
+            <w:rStyle w:val="Hyperlink"/>
+          </w:rPr>
+          <w:t xml:space="preserve">function</w:t>
+        </w:r>
+      </w:hyperlink>
+      <w:r>
+        <w:t xml:space="preserve">:</w:t>
+      </w:r>
+      <w:r>
+        <w:t xml:space="preserve"> </w:t>
+      </w:r>
+      <w:r>
+        <w:t xml:space="preserve">for each input it returns the function’s value at that input.</w:t>
+      </w:r>
+    </w:p>
+    <w:bookmarkEnd w:id="84"/>
+    <w:bookmarkStart w:id="85" w:name="exm-algorithm"/>
+    <w:p>
+      <w:pPr>
+        <w:pStyle w:val="BodyText"/>
+      </w:pPr>
+      <w:r>
+        <w:rPr>
+          <w:b/>
+          <w:bCs/>
+        </w:rPr>
+        <w:t xml:space="preserve">Example 24 (Two algorithms for one function)</w:t>
+      </w:r>
+      <w:r>
+        <w:t xml:space="preserve"> </w:t>
+      </w:r>
+      <w:r>
+        <w:t xml:space="preserve">Take the function that</w:t>
+      </w:r>
+      <w:r>
+        <w:t xml:space="preserve"> </w:t>
+      </w:r>
+      <w:hyperlink w:anchor="exm-expression">
+        <w:r>
+          <w:rPr>
+            <w:rStyle w:val="Hyperlink"/>
+          </w:rPr>
+          <w:t xml:space="preserve">Example 22</w:t>
+        </w:r>
+      </w:hyperlink>
+      <w:r>
+        <w:t xml:space="preserve"> </w:t>
+      </w:r>
+      <w:r>
+        <w:t xml:space="preserve">writes two ways.</w:t>
+      </w:r>
+      <w:r>
+        <w:t xml:space="preserve"> </w:t>
+      </w:r>
+      <w:r>
+        <w:t xml:space="preserve">Evaluating the tree of</w:t>
+      </w:r>
+      <w:r>
+        <w:t xml:space="preserve"> </w:t>
+      </w:r>
+      <m:oMath>
+        <m:r>
+          <m:t>a</m:t>
+        </m:r>
+        <m:sSup>
+          <m:e>
+            <m:r>
+              <m:t>x</m:t>
+            </m:r>
+          </m:e>
+          <m:sup>
+            <m:r>
+              <m:t>2</m:t>
+            </m:r>
+          </m:sup>
+        </m:sSup>
+        <m:r>
+          <m:rPr>
+            <m:sty m:val="p"/>
+          </m:rPr>
+          <m:t>+</m:t>
+        </m:r>
+        <m:r>
+          <m:t>b</m:t>
+        </m:r>
+        <m:r>
+          <m:t>x</m:t>
+        </m:r>
+        <m:r>
+          <m:rPr>
+            <m:sty m:val="p"/>
+          </m:rPr>
+          <m:t>+</m:t>
+        </m:r>
+        <m:r>
+          <m:t>c</m:t>
+        </m:r>
+      </m:oMath>
+      <w:r>
+        <w:t xml:space="preserve">, with</w:t>
+      </w:r>
+      <w:r>
+        <w:t xml:space="preserve"> </w:t>
+      </w:r>
+      <m:oMath>
+        <m:sSup>
+          <m:e>
+            <m:r>
+              <m:t>x</m:t>
+            </m:r>
+          </m:e>
+          <m:sup>
+            <m:r>
+              <m:t>2</m:t>
+            </m:r>
+          </m:sup>
+        </m:sSup>
+      </m:oMath>
+      <w:r>
+        <w:t xml:space="preserve"> </w:t>
+      </w:r>
+      <w:r>
+        <w:t xml:space="preserve">computed as</w:t>
+      </w:r>
+      <w:r>
+        <w:t xml:space="preserve"> </w:t>
+      </w:r>
+      <m:oMath>
+        <m:r>
+          <m:t>x</m:t>
+        </m:r>
+        <m:r>
+          <m:rPr>
+            <m:sty m:val="p"/>
+          </m:rPr>
+          <m:t>⋅</m:t>
+        </m:r>
+        <m:r>
+          <m:t>x</m:t>
+        </m:r>
+      </m:oMath>
+      <w:r>
+        <w:t xml:space="preserve">,</w:t>
+      </w:r>
+      <w:r>
+        <w:t xml:space="preserve"> </w:t>
+      </w:r>
+      <w:r>
+        <w:t xml:space="preserve">takes three multiplications and two additions.</w:t>
+      </w:r>
+      <w:r>
+        <w:t xml:space="preserve"> </w:t>
+      </w:r>
+      <w:r>
+        <w:t xml:space="preserve">Evaluating the tree of Horner’s form</w:t>
+      </w:r>
+      <w:r>
+        <w:t xml:space="preserve"> </w:t>
+      </w:r>
+      <m:oMath>
+        <m:r>
+          <m:rPr>
+            <m:sty m:val="p"/>
+          </m:rPr>
+          <m:t>(</m:t>
+        </m:r>
+        <m:r>
+          <m:t>a</m:t>
+        </m:r>
+        <m:r>
+          <m:t>x</m:t>
+        </m:r>
+        <m:r>
+          <m:rPr>
+            <m:sty m:val="p"/>
+          </m:rPr>
+          <m:t>+</m:t>
+        </m:r>
+        <m:r>
+          <m:t>b</m:t>
+        </m:r>
+        <m:r>
+          <m:rPr>
+            <m:sty m:val="p"/>
+          </m:rPr>
+          <m:t>)</m:t>
+        </m:r>
+        <m:r>
+          <m:t> </m:t>
+        </m:r>
+        <m:r>
+          <m:t>x</m:t>
+        </m:r>
+        <m:r>
+          <m:rPr>
+            <m:sty m:val="p"/>
+          </m:rPr>
+          <m:t>+</m:t>
+        </m:r>
+        <m:r>
+          <m:t>c</m:t>
+        </m:r>
+      </m:oMath>
+      <w:r>
+        <w:t xml:space="preserve"> </w:t>
+      </w:r>
+      <w:r>
+        <w:t xml:space="preserve">takes two multiplications and two additions.</w:t>
+      </w:r>
+      <w:r>
+        <w:t xml:space="preserve"> </w:t>
+      </w:r>
+      <w:r>
+        <w:t xml:space="preserve">At</w:t>
+      </w:r>
+      <w:r>
+        <w:t xml:space="preserve"> </w:t>
+      </w:r>
+      <m:oMath>
+        <m:r>
+          <m:t>a</m:t>
+        </m:r>
+        <m:r>
+          <m:rPr>
+            <m:sty m:val="p"/>
+          </m:rPr>
+          <m:t>=</m:t>
+        </m:r>
+        <m:r>
+          <m:t>2</m:t>
+        </m:r>
+      </m:oMath>
+      <w:r>
+        <w:t xml:space="preserve">,</w:t>
+      </w:r>
+      <w:r>
+        <w:t xml:space="preserve"> </w:t>
+      </w:r>
+      <m:oMath>
+        <m:r>
+          <m:t>b</m:t>
+        </m:r>
+        <m:r>
+          <m:rPr>
+            <m:sty m:val="p"/>
+          </m:rPr>
+          <m:t>=</m:t>
+        </m:r>
+        <m:r>
+          <m:rPr>
+            <m:sty m:val="p"/>
+          </m:rPr>
+          <m:t>−</m:t>
+        </m:r>
+        <m:r>
+          <m:t>3</m:t>
+        </m:r>
+      </m:oMath>
+      <w:r>
+        <w:t xml:space="preserve">,</w:t>
+      </w:r>
+      <w:r>
+        <w:t xml:space="preserve"> </w:t>
+      </w:r>
+      <m:oMath>
+        <m:r>
+          <m:t>c</m:t>
+        </m:r>
+        <m:r>
+          <m:rPr>
+            <m:sty m:val="p"/>
+          </m:rPr>
+          <m:t>=</m:t>
+        </m:r>
+        <m:r>
+          <m:t>5</m:t>
+        </m:r>
+      </m:oMath>
+      <w:r>
+        <w:t xml:space="preserve"> </w:t>
+      </w:r>
+      <w:r>
+        <w:t xml:space="preserve">and</w:t>
+      </w:r>
+      <w:r>
+        <w:t xml:space="preserve"> </w:t>
+      </w:r>
+      <m:oMath>
+        <m:r>
+          <m:t>x</m:t>
+        </m:r>
+        <m:r>
+          <m:rPr>
+            <m:sty m:val="p"/>
+          </m:rPr>
+          <m:t>=</m:t>
+        </m:r>
+        <m:r>
+          <m:t>1.5</m:t>
+        </m:r>
+      </m:oMath>
+      <w:r>
+        <w:t xml:space="preserve">,</w:t>
+      </w:r>
+      <w:r>
+        <w:t xml:space="preserve"> </w:t>
+      </w:r>
+      <w:r>
+        <w:t xml:space="preserve">the first algorithm computes</w:t>
+      </w:r>
+      <w:r>
+        <w:t xml:space="preserve"> </w:t>
+      </w:r>
+      <m:oMath>
+        <m:r>
+          <m:t>4.5</m:t>
+        </m:r>
+        <m:r>
+          <m:rPr>
+            <m:sty m:val="p"/>
+          </m:rPr>
+          <m:t>−</m:t>
+        </m:r>
+        <m:r>
+          <m:t>4.5</m:t>
+        </m:r>
+        <m:r>
+          <m:rPr>
+            <m:sty m:val="p"/>
+          </m:rPr>
+          <m:t>+</m:t>
+        </m:r>
+        <m:r>
+          <m:t>5</m:t>
+        </m:r>
+        <m:r>
+          <m:rPr>
+            <m:sty m:val="p"/>
+          </m:rPr>
+          <m:t>=</m:t>
+        </m:r>
+        <m:r>
+          <m:t>5</m:t>
+        </m:r>
+      </m:oMath>
+      <w:r>
+        <w:t xml:space="preserve"> </w:t>
+      </w:r>
+      <w:r>
+        <w:t xml:space="preserve">and the second computes</w:t>
+      </w:r>
+      <w:r>
+        <w:t xml:space="preserve"> </w:t>
+      </w:r>
+      <m:oMath>
+        <m:r>
+          <m:rPr>
+            <m:sty m:val="p"/>
+          </m:rPr>
+          <m:t>(</m:t>
+        </m:r>
+        <m:r>
+          <m:t>3</m:t>
+        </m:r>
+        <m:r>
+          <m:rPr>
+            <m:sty m:val="p"/>
+          </m:rPr>
+          <m:t>−</m:t>
+        </m:r>
+        <m:r>
+          <m:t>3</m:t>
+        </m:r>
+        <m:r>
+          <m:rPr>
+            <m:sty m:val="p"/>
+          </m:rPr>
+          <m:t>)</m:t>
+        </m:r>
+        <m:r>
+          <m:rPr>
+            <m:sty m:val="p"/>
+          </m:rPr>
+          <m:t>⋅</m:t>
+        </m:r>
+        <m:r>
+          <m:t>1.5</m:t>
+        </m:r>
+        <m:r>
+          <m:rPr>
+            <m:sty m:val="p"/>
+          </m:rPr>
+          <m:t>+</m:t>
+        </m:r>
+        <m:r>
+          <m:t>5</m:t>
+        </m:r>
+        <m:r>
+          <m:rPr>
+            <m:sty m:val="p"/>
+          </m:rPr>
+          <m:t>=</m:t>
+        </m:r>
+        <m:r>
+          <m:t>5</m:t>
+        </m:r>
+      </m:oMath>
+      <w:r>
+        <w:t xml:space="preserve">,</w:t>
+      </w:r>
+      <w:r>
+        <w:t xml:space="preserve"> </w:t>
+      </w:r>
+      <w:r>
+        <w:t xml:space="preserve">the same value by different steps.</w:t>
+      </w:r>
+    </w:p>
+    <w:bookmarkEnd w:id="85"/>
+    <w:bookmarkStart w:id="86" w:name="rem-function-expression-algorithm"/>
+    <w:p>
+      <w:pPr>
+        <w:pStyle w:val="BodyText"/>
+      </w:pPr>
+      <w:r>
+        <w:rPr>
+          <w:i/>
+          <w:iCs/>
+        </w:rPr>
+        <w:t xml:space="preserve">Remark 10</w:t>
+      </w:r>
+      <w:r>
+        <w:t xml:space="preserve"> (How functions, expressions and algorithms relate). </w:t>
+      </w:r>
+      <w:r>
+        <w:t xml:space="preserve">The three ideas fit together this way:</w:t>
+      </w:r>
+    </w:p>
+    <w:p>
+      <w:pPr>
+        <w:pStyle w:val="Compact"/>
+        <w:numPr>
+          <w:ilvl w:val="0"/>
+          <w:numId w:val="1023"/>
+        </w:numPr>
+      </w:pPr>
+      <w:r>
+        <w:t xml:space="preserve">A function is the input-output relationship.</w:t>
+      </w:r>
+    </w:p>
+    <w:p>
+      <w:pPr>
+        <w:pStyle w:val="Compact"/>
+        <w:numPr>
+          <w:ilvl w:val="0"/>
+          <w:numId w:val="1023"/>
+        </w:numPr>
+      </w:pPr>
+      <w:r>
+        <w:t xml:space="preserve">An</w:t>
+      </w:r>
+      <w:r>
+        <w:t xml:space="preserve"> </w:t>
+      </w:r>
+      <w:hyperlink w:anchor="def-expression">
+        <w:r>
+          <w:rPr>
+            <w:rStyle w:val="Hyperlink"/>
+          </w:rPr>
+          <w:t xml:space="preserve">expression</w:t>
+        </w:r>
+      </w:hyperlink>
+      <w:r>
+        <w:t xml:space="preserve"> </w:t>
+      </w:r>
+      <w:r>
+        <w:t xml:space="preserve">denotes a function,</w:t>
+      </w:r>
+      <w:r>
+        <w:t xml:space="preserve"> </w:t>
+      </w:r>
+      <w:r>
+        <w:t xml:space="preserve">and many expressions denote the same one.</w:t>
+      </w:r>
+    </w:p>
+    <w:p>
+      <w:pPr>
+        <w:pStyle w:val="Compact"/>
+        <w:numPr>
+          <w:ilvl w:val="0"/>
+          <w:numId w:val="1023"/>
+        </w:numPr>
+      </w:pPr>
+      <w:r>
+        <w:t xml:space="preserve">An</w:t>
+      </w:r>
+      <w:r>
+        <w:t xml:space="preserve"> </w:t>
+      </w:r>
+      <w:hyperlink w:anchor="def-algorithm">
+        <w:r>
+          <w:rPr>
+            <w:rStyle w:val="Hyperlink"/>
+          </w:rPr>
+          <w:t xml:space="preserve">algorithm</w:t>
+        </w:r>
+      </w:hyperlink>
+      <w:r>
+        <w:t xml:space="preserve"> </w:t>
+      </w:r>
+      <w:r>
+        <w:t xml:space="preserve">computes a function,</w:t>
+      </w:r>
+      <w:r>
+        <w:t xml:space="preserve"> </w:t>
+      </w:r>
+      <w:r>
+        <w:t xml:space="preserve">and many algorithms compute the same one.</w:t>
+      </w:r>
+    </w:p>
+    <w:p>
+      <w:pPr>
+        <w:pStyle w:val="FirstParagraph"/>
+      </w:pPr>
+      <w:r>
+        <w:t xml:space="preserve">An expression is not an algorithm,</w:t>
+      </w:r>
+      <w:r>
+        <w:t xml:space="preserve"> </w:t>
+      </w:r>
+      <w:r>
+        <w:t xml:space="preserve">because it does not say what to do, or in what order.</w:t>
+      </w:r>
+      <w:r>
+        <w:t xml:space="preserve"> </w:t>
+      </w:r>
+      <w:r>
+        <w:t xml:space="preserve">Given values for its variables,</w:t>
+      </w:r>
+      <w:r>
+        <w:t xml:space="preserve"> </w:t>
+      </w:r>
+      <w:r>
+        <w:t xml:space="preserve">evaluating its parse tree from the leaves up is one algorithm for the function it denotes,</w:t>
+      </w:r>
+      <w:r>
+        <w:t xml:space="preserve"> </w:t>
+      </w:r>
+      <w:r>
+        <w:t xml:space="preserve">and a different expression for the same function gives a different tree and a different algorithm.</w:t>
+      </w:r>
+    </w:p>
+    <w:bookmarkEnd w:id="86"/>
+    <w:bookmarkStart w:id="87" w:name="rem-no-known-algorithm"/>
+    <w:p>
+      <w:pPr>
+        <w:pStyle w:val="BodyText"/>
+      </w:pPr>
+      <w:r>
+        <w:rPr>
+          <w:i/>
+          <w:iCs/>
+        </w:rPr>
+        <w:t xml:space="preserve">Remark 11</w:t>
+      </w:r>
+      <w:r>
+        <w:t xml:space="preserve"> (Values with no known algorithm). </w:t>
+      </w:r>
+      <w:r>
+        <w:t xml:space="preserve">Some functions have no known finite algorithm for their exact values,</w:t>
+      </w:r>
+      <w:r>
+        <w:t xml:space="preserve"> </w:t>
+      </w:r>
+      <w:r>
+        <w:t xml:space="preserve">and expressions that denote them,</w:t>
+      </w:r>
+      <w:r>
+        <w:t xml:space="preserve"> </w:t>
+      </w:r>
+      <w:r>
+        <w:t xml:space="preserve">such as a limit, a supremum, an integral with no closed form,</w:t>
+      </w:r>
+      <w:r>
+        <w:t xml:space="preserve"> </w:t>
+      </w:r>
+      <w:r>
+        <w:t xml:space="preserve">or an</w:t>
+      </w:r>
+      <w:r>
+        <w:t xml:space="preserve"> </w:t>
+      </w:r>
+      <m:oMath>
+        <m:r>
+          <m:rPr>
+            <m:sty m:val="p"/>
+          </m:rPr>
+          <m:t>arg</m:t>
+        </m:r>
+        <m:r>
+          <m:rPr>
+            <m:sty m:val="p"/>
+          </m:rPr>
+          <m:t>min</m:t>
+        </m:r>
+      </m:oMath>
+      <w:r>
+        <w:t xml:space="preserve"> </w:t>
+      </w:r>
+      <w:r>
+        <w:t xml:space="preserve">over a set with no formula for the minimizer,</w:t>
+      </w:r>
+      <w:r>
+        <w:t xml:space="preserve"> </w:t>
+      </w:r>
+      <w:r>
+        <w:t xml:space="preserve">cannot be evaluated by following their tree.</w:t>
+      </w:r>
+      <w:r>
+        <w:t xml:space="preserve"> </w:t>
+      </w:r>
+      <w:r>
+        <w:t xml:space="preserve">Such a value can still be well defined and approximated by an algorithm.</w:t>
+      </w:r>
+    </w:p>
+    <w:bookmarkEnd w:id="87"/>
+    <w:bookmarkStart w:id="88" w:name="exm-no-known-algorithm"/>
+    <w:p>
+      <w:pPr>
+        <w:pStyle w:val="BodyText"/>
+      </w:pPr>
+      <w:r>
+        <w:rPr>
+          <w:b/>
+          <w:bCs/>
+        </w:rPr>
+        <w:t xml:space="preserve">Example 25 (A minimizer with no known formula)</w:t>
+      </w:r>
+      <w:r>
+        <w:t xml:space="preserve"> </w:t>
+      </w:r>
+      <w:r>
+        <w:t xml:space="preserve">The minimizer</w:t>
+      </w:r>
+      <w:r>
+        <w:t xml:space="preserve"> </w:t>
+      </w:r>
+      <m:oMath>
+        <m:r>
+          <m:rPr>
+            <m:sty m:val="p"/>
+          </m:rPr>
+          <m:t>arg</m:t>
+        </m:r>
+        <m:sSub>
+          <m:e>
+            <m:r>
+              <m:rPr>
+                <m:sty m:val="p"/>
+              </m:rPr>
+              <m:t>min</m:t>
+            </m:r>
+          </m:e>
+          <m:sub>
+            <m:r>
+              <m:t>x</m:t>
+            </m:r>
+            <m:r>
+              <m:rPr>
+                <m:sty m:val="p"/>
+              </m:rPr>
+              <m:t>∈</m:t>
+            </m:r>
+            <m:r>
+              <m:rPr>
+                <m:scr m:val="double-struck"/>
+                <m:sty m:val="p"/>
+              </m:rPr>
+              <m:t>R</m:t>
+            </m:r>
+          </m:sub>
+        </m:sSub>
+        <m:r>
+          <m:t>​</m:t>
+        </m:r>
+        <m:d>
+          <m:dPr>
+            <m:begChr m:val="("/>
+            <m:sepChr m:val=""/>
+            <m:endChr m:val=")"/>
+            <m:grow/>
+          </m:dPr>
+          <m:e>
+            <m:r>
+              <m:t>x</m:t>
+            </m:r>
+            <m:r>
+              <m:rPr>
+                <m:sty m:val="p"/>
+              </m:rPr>
+              <m:t>−</m:t>
+            </m:r>
+            <m:r>
+              <m:rPr>
+                <m:sty m:val="p"/>
+              </m:rPr>
+              <m:t>cos</m:t>
+            </m:r>
+            <m:r>
+              <m:t>x</m:t>
+            </m:r>
+          </m:e>
+        </m:d>
+        <m:sSup>
+          <m:e>
+            <m:r>
+              <m:t>​</m:t>
+            </m:r>
+          </m:e>
+          <m:sup>
+            <m:r>
+              <m:t>2</m:t>
+            </m:r>
+          </m:sup>
+        </m:sSup>
+      </m:oMath>
+      <w:r>
+        <w:t xml:space="preserve"> </w:t>
+      </w:r>
+      <w:r>
+        <w:t xml:space="preserve">is well defined,</w:t>
+      </w:r>
+      <w:r>
+        <w:t xml:space="preserve"> </w:t>
+      </w:r>
+      <w:r>
+        <w:t xml:space="preserve">because</w:t>
+      </w:r>
+      <w:r>
+        <w:t xml:space="preserve"> </w:t>
+      </w:r>
+      <m:oMath>
+        <m:r>
+          <m:t>x</m:t>
+        </m:r>
+        <m:r>
+          <m:rPr>
+            <m:sty m:val="p"/>
+          </m:rPr>
+          <m:t>−</m:t>
+        </m:r>
+        <m:r>
+          <m:rPr>
+            <m:sty m:val="p"/>
+          </m:rPr>
+          <m:t>cos</m:t>
+        </m:r>
+        <m:r>
+          <m:t>x</m:t>
+        </m:r>
+      </m:oMath>
+      <w:r>
+        <w:t xml:space="preserve"> </w:t>
+      </w:r>
+      <w:r>
+        <w:t xml:space="preserve">is strictly increasing and equals zero at one point,</w:t>
+      </w:r>
+      <w:r>
+        <w:t xml:space="preserve"> </w:t>
+      </w:r>
+      <w:r>
+        <w:t xml:space="preserve">yet that point has no known closed-form expression,</w:t>
+      </w:r>
+      <w:r>
+        <w:t xml:space="preserve"> </w:t>
+      </w:r>
+      <w:r>
+        <w:t xml:space="preserve">so no known finite list of arithmetic steps returns it exactly.</w:t>
+      </w:r>
+      <w:r>
+        <w:t xml:space="preserve"> </w:t>
+      </w:r>
+      <w:r>
+        <w:t xml:space="preserve">An algorithm such as bisection approximates it as closely as we like.</w:t>
+      </w:r>
+    </w:p>
+    <w:bookmarkEnd w:id="88"/>
+    <w:bookmarkEnd w:id="89"/>
+    <w:bookmarkStart w:id="104" w:name="countable-sets"/>
     <w:p>
       <w:pPr>
         <w:pStyle w:val="Heading2"/>
@@ -24527,7 +26619,7 @@
         <w:t xml:space="preserve">4 Countable sets</w:t>
       </w:r>
     </w:p>
-    <w:bookmarkStart w:id="80" w:name="def-finite-set"/>
+    <w:bookmarkStart w:id="90" w:name="def-finite-set"/>
     <w:p>
       <w:pPr>
         <w:pStyle w:val="FirstParagraph"/>
@@ -24537,7 +26629,7 @@
           <w:b/>
           <w:bCs/>
         </w:rPr>
-        <w:t xml:space="preserve">Definition 26 (Finite set, infinite set, and cardinality)</w:t>
+        <w:t xml:space="preserve">Definition 29 (Finite set, infinite set, and cardinality)</w:t>
       </w:r>
       <w:r>
         <w:t xml:space="preserve"> </w:t>
@@ -24823,8 +26915,8 @@
         <w:t xml:space="preserve">.</w:t>
       </w:r>
     </w:p>
-    <w:bookmarkEnd w:id="80"/>
-    <w:bookmarkStart w:id="83" w:name="rem-cardinality-bars"/>
+    <w:bookmarkEnd w:id="90"/>
+    <w:bookmarkStart w:id="93" w:name="rem-cardinality-bars"/>
     <w:p>
       <w:pPr>
         <w:pStyle w:val="BodyText"/>
@@ -24834,7 +26926,7 @@
           <w:i/>
           <w:iCs/>
         </w:rPr>
-        <w:t xml:space="preserve">Remark 9</w:t>
+        <w:t xml:space="preserve">Remark 12</w:t>
       </w:r>
       <w:r>
         <w:t xml:space="preserve"> (Two meanings of</w:t>
@@ -24952,7 +27044,7 @@
       <w:r>
         <w:t xml:space="preserve"> </w:t>
       </w:r>
-      <w:hyperlink r:id="rId81">
+      <w:hyperlink r:id="rId91">
         <w:r>
           <w:rPr>
             <w:rStyle w:val="Hyperlink"/>
@@ -24972,7 +27064,7 @@
       <w:r>
         <w:t xml:space="preserve"> </w:t>
       </w:r>
-      <w:hyperlink r:id="rId82">
+      <w:hyperlink r:id="rId92">
         <w:r>
           <w:rPr>
             <w:rStyle w:val="Hyperlink"/>
@@ -25107,8 +27199,8 @@
         <w:t xml:space="preserve">.</w:t>
       </w:r>
     </w:p>
-    <w:bookmarkEnd w:id="83"/>
-    <w:bookmarkStart w:id="84" w:name="exm-finite-set"/>
+    <w:bookmarkEnd w:id="93"/>
+    <w:bookmarkStart w:id="94" w:name="exm-finite-set"/>
     <w:p>
       <w:pPr>
         <w:pStyle w:val="BodyText"/>
@@ -25118,7 +27210,7 @@
           <w:b/>
           <w:bCs/>
         </w:rPr>
-        <w:t xml:space="preserve">Example 22 (Finite and infinite sets)</w:t>
+        <w:t xml:space="preserve">Example 26 (Finite and infinite sets)</w:t>
       </w:r>
       <w:r>
         <w:t xml:space="preserve"> </w:t>
@@ -25132,7 +27224,7 @@
         <w:pStyle w:val="Compact"/>
         <w:numPr>
           <w:ilvl w:val="0"/>
-          <w:numId w:val="1019"/>
+          <w:numId w:val="1024"/>
         </w:numPr>
       </w:pPr>
       <m:oMath>
@@ -25256,7 +27348,7 @@
         <w:pStyle w:val="Compact"/>
         <w:numPr>
           <w:ilvl w:val="0"/>
-          <w:numId w:val="1019"/>
+          <w:numId w:val="1024"/>
         </w:numPr>
       </w:pPr>
       <m:oMath>
@@ -25417,7 +27509,7 @@
         <w:pStyle w:val="Compact"/>
         <w:numPr>
           <w:ilvl w:val="0"/>
-          <w:numId w:val="1019"/>
+          <w:numId w:val="1024"/>
         </w:numPr>
       </w:pPr>
       <m:oMath>
@@ -25479,7 +27571,7 @@
         <w:pStyle w:val="Compact"/>
         <w:numPr>
           <w:ilvl w:val="0"/>
-          <w:numId w:val="1019"/>
+          <w:numId w:val="1024"/>
         </w:numPr>
       </w:pPr>
       <w:r>
@@ -25700,8 +27792,8 @@
         <w:t xml:space="preserve">which is larger than every number in the list.</w:t>
       </w:r>
     </w:p>
-    <w:bookmarkEnd w:id="84"/>
-    <w:bookmarkStart w:id="85" w:name="def-countable-set"/>
+    <w:bookmarkEnd w:id="94"/>
+    <w:bookmarkStart w:id="95" w:name="def-countable-set"/>
     <w:p>
       <w:pPr>
         <w:pStyle w:val="FirstParagraph"/>
@@ -25711,7 +27803,7 @@
           <w:b/>
           <w:bCs/>
         </w:rPr>
-        <w:t xml:space="preserve">Definition 27 (Countable set)</w:t>
+        <w:t xml:space="preserve">Definition 30 (Countable set)</w:t>
       </w:r>
       <w:r>
         <w:t xml:space="preserve"> </w:t>
@@ -25740,7 +27832,7 @@
           <w:rPr>
             <w:rStyle w:val="Hyperlink"/>
           </w:rPr>
-          <w:t xml:space="preserve">Definition 26</w:t>
+          <w:t xml:space="preserve">Definition 29</w:t>
         </w:r>
       </w:hyperlink>
       <w:r>
@@ -25835,8 +27927,8 @@
         <w:t xml:space="preserve">in which every element appears.</w:t>
       </w:r>
     </w:p>
-    <w:bookmarkEnd w:id="85"/>
-    <w:bookmarkStart w:id="86" w:name="def-countably-infinite"/>
+    <w:bookmarkEnd w:id="95"/>
+    <w:bookmarkStart w:id="96" w:name="def-countably-infinite"/>
     <w:p>
       <w:pPr>
         <w:pStyle w:val="BodyText"/>
@@ -25846,7 +27938,7 @@
           <w:b/>
           <w:bCs/>
         </w:rPr>
-        <w:t xml:space="preserve">Definition 28 (Countably infinite set)</w:t>
+        <w:t xml:space="preserve">Definition 31 (Countably infinite set)</w:t>
       </w:r>
       <w:r>
         <w:t xml:space="preserve"> </w:t>
@@ -25888,8 +27980,8 @@
         <w:t xml:space="preserve">and not finite.</w:t>
       </w:r>
     </w:p>
-    <w:bookmarkEnd w:id="86"/>
-    <w:bookmarkStart w:id="89" w:name="exm-countable-set"/>
+    <w:bookmarkEnd w:id="96"/>
+    <w:bookmarkStart w:id="99" w:name="exm-countable-set"/>
     <w:p>
       <w:pPr>
         <w:pStyle w:val="BodyText"/>
@@ -25899,7 +27991,7 @@
           <w:b/>
           <w:bCs/>
         </w:rPr>
-        <w:t xml:space="preserve">Example 23 (Countable and uncountable sets)</w:t>
+        <w:t xml:space="preserve">Example 27 (Countable and uncountable sets)</w:t>
       </w:r>
       <w:r>
         <w:t xml:space="preserve"> </w:t>
@@ -25913,7 +28005,7 @@
         <w:pStyle w:val="Compact"/>
         <w:numPr>
           <w:ilvl w:val="0"/>
-          <w:numId w:val="1020"/>
+          <w:numId w:val="1025"/>
         </w:numPr>
       </w:pPr>
       <m:oMath>
@@ -25994,7 +28086,7 @@
         <w:pStyle w:val="Compact"/>
         <w:numPr>
           <w:ilvl w:val="0"/>
-          <w:numId w:val="1020"/>
+          <w:numId w:val="1025"/>
         </w:numPr>
       </w:pPr>
       <w:r>
@@ -26003,7 +28095,7 @@
       <w:r>
         <w:t xml:space="preserve"> </w:t>
       </w:r>
-      <w:hyperlink r:id="rId87">
+      <w:hyperlink r:id="rId97">
         <w:r>
           <w:rPr>
             <w:rStyle w:val="Hyperlink"/>
@@ -26127,7 +28219,7 @@
         <w:pStyle w:val="Compact"/>
         <w:numPr>
           <w:ilvl w:val="0"/>
-          <w:numId w:val="1020"/>
+          <w:numId w:val="1025"/>
         </w:numPr>
       </w:pPr>
       <w:r>
@@ -26136,7 +28228,7 @@
       <w:r>
         <w:t xml:space="preserve"> </w:t>
       </w:r>
-      <w:hyperlink r:id="rId88">
+      <w:hyperlink r:id="rId98">
         <w:r>
           <w:rPr>
             <w:rStyle w:val="Hyperlink"/>
@@ -26255,8 +28347,8 @@
         <w:t xml:space="preserve">lists every one of them.</w:t>
       </w:r>
     </w:p>
-    <w:bookmarkEnd w:id="89"/>
-    <w:bookmarkStart w:id="90" w:name="thm-interval-uncountable"/>
+    <w:bookmarkEnd w:id="99"/>
+    <w:bookmarkStart w:id="100" w:name="thm-interval-uncountable"/>
     <w:p>
       <w:pPr>
         <w:pStyle w:val="FirstParagraph"/>
@@ -26324,8 +28416,8 @@
         <w:t xml:space="preserve">.</w:t>
       </w:r>
     </w:p>
-    <w:bookmarkEnd w:id="90"/>
-    <w:bookmarkStart w:id="93" w:name="rem-cantor-diagonal"/>
+    <w:bookmarkEnd w:id="100"/>
+    <w:bookmarkStart w:id="103" w:name="rem-cantor-diagonal"/>
     <w:p>
       <w:pPr>
         <w:pStyle w:val="BodyText"/>
@@ -26335,7 +28427,7 @@
           <w:i/>
           <w:iCs/>
         </w:rPr>
-        <w:t xml:space="preserve">Remark 10</w:t>
+        <w:t xml:space="preserve">Remark 13</w:t>
       </w:r>
       <w:r>
         <w:t xml:space="preserve"> (Cantor’s diagonal argument). </w:t>
@@ -26346,7 +28438,7 @@
       <w:r>
         <w:t xml:space="preserve"> </w:t>
       </w:r>
-      <w:hyperlink r:id="rId91">
+      <w:hyperlink r:id="rId101">
         <w:r>
           <w:rPr>
             <w:rStyle w:val="Hyperlink"/>
@@ -26551,7 +28643,7 @@
       <w:r>
         <w:t xml:space="preserve"> </w:t>
       </w:r>
-      <w:hyperlink r:id="rId92">
+      <w:hyperlink r:id="rId102">
         <w:r>
           <w:rPr>
             <w:rStyle w:val="Hyperlink"/>
@@ -26778,9 +28870,9 @@
         <w:t xml:space="preserve">and from the third in the third digit.</w:t>
       </w:r>
     </w:p>
-    <w:bookmarkEnd w:id="93"/>
-    <w:bookmarkEnd w:id="94"/>
-    <w:bookmarkStart w:id="99" w:name="extended-non-negative-real-numbers"/>
+    <w:bookmarkEnd w:id="103"/>
+    <w:bookmarkEnd w:id="104"/>
+    <w:bookmarkStart w:id="109" w:name="extended-non-negative-real-numbers"/>
     <w:p>
       <w:pPr>
         <w:pStyle w:val="Heading2"/>
@@ -26789,7 +28881,7 @@
         <w:t xml:space="preserve">5 Extended non-negative real numbers</w:t>
       </w:r>
     </w:p>
-    <w:bookmarkStart w:id="95" w:name="def-extended-nonneg-reals"/>
+    <w:bookmarkStart w:id="105" w:name="def-extended-nonneg-reals"/>
     <w:p>
       <w:pPr>
         <w:pStyle w:val="FirstParagraph"/>
@@ -26799,7 +28891,7 @@
           <w:b/>
           <w:bCs/>
         </w:rPr>
-        <w:t xml:space="preserve">Definition 29 (Extended non-negative real numbers)</w:t>
+        <w:t xml:space="preserve">Definition 32 (Extended non-negative real numbers)</w:t>
       </w:r>
       <w:r>
         <w:t xml:space="preserve"> </w:t>
@@ -27162,8 +29254,8 @@
         <w:t xml:space="preserve">.</w:t>
       </w:r>
     </w:p>
-    <w:bookmarkEnd w:id="95"/>
-    <w:bookmarkStart w:id="97" w:name="rem-infinity-arithmetic"/>
+    <w:bookmarkEnd w:id="105"/>
+    <w:bookmarkStart w:id="107" w:name="rem-infinity-arithmetic"/>
     <w:p>
       <w:pPr>
         <w:pStyle w:val="BodyText"/>
@@ -27173,7 +29265,7 @@
           <w:i/>
           <w:iCs/>
         </w:rPr>
-        <w:t xml:space="preserve">Remark 11</w:t>
+        <w:t xml:space="preserve">Remark 14</w:t>
       </w:r>
       <w:r>
         <w:t xml:space="preserve"> (Arithmetic with</w:t>
@@ -27367,7 +29459,7 @@
       <w:r>
         <w:t xml:space="preserve"> </w:t>
       </w:r>
-      <w:hyperlink r:id="rId96">
+      <w:hyperlink r:id="rId106">
         <w:r>
           <w:rPr>
             <w:rStyle w:val="Hyperlink"/>
@@ -27379,8 +29471,8 @@
         <w:t xml:space="preserve">).</w:t>
       </w:r>
     </w:p>
-    <w:bookmarkEnd w:id="97"/>
-    <w:bookmarkStart w:id="98" w:name="exm-extended-nonneg-reals"/>
+    <w:bookmarkEnd w:id="107"/>
+    <w:bookmarkStart w:id="108" w:name="exm-extended-nonneg-reals"/>
     <w:p>
       <w:pPr>
         <w:pStyle w:val="BodyText"/>
@@ -27390,7 +29482,7 @@
           <w:b/>
           <w:bCs/>
         </w:rPr>
-        <w:t xml:space="preserve">Example 24 (Adding with</w:t>
+        <w:t xml:space="preserve">Example 28 (Adding with</w:t>
       </w:r>
       <w:r>
         <w:rPr>
@@ -27570,9 +29662,9 @@
         <w:t xml:space="preserve">.</w:t>
       </w:r>
     </w:p>
-    <w:bookmarkEnd w:id="98"/>
-    <w:bookmarkEnd w:id="99"/>
-    <w:bookmarkStart w:id="100" w:name="sec-further-reading"/>
+    <w:bookmarkEnd w:id="108"/>
+    <w:bookmarkEnd w:id="109"/>
+    <w:bookmarkStart w:id="110" w:name="sec-further-reading"/>
     <w:p>
       <w:pPr>
         <w:pStyle w:val="Heading2"/>
@@ -27594,7 +29686,7 @@
         <w:pStyle w:val="Compact"/>
         <w:numPr>
           <w:ilvl w:val="0"/>
-          <w:numId w:val="1021"/>
+          <w:numId w:val="1026"/>
         </w:numPr>
       </w:pPr>
       <w:r>
@@ -27624,7 +29716,7 @@
         <w:pStyle w:val="Compact"/>
         <w:numPr>
           <w:ilvl w:val="0"/>
-          <w:numId w:val="1021"/>
+          <w:numId w:val="1026"/>
         </w:numPr>
       </w:pPr>
       <w:r>
@@ -27648,7 +29740,7 @@
         <w:pStyle w:val="Compact"/>
         <w:numPr>
           <w:ilvl w:val="0"/>
-          <w:numId w:val="1021"/>
+          <w:numId w:val="1026"/>
         </w:numPr>
       </w:pPr>
       <w:r>
@@ -27678,7 +29770,7 @@
         <w:pStyle w:val="Compact"/>
         <w:numPr>
           <w:ilvl w:val="0"/>
-          <w:numId w:val="1021"/>
+          <w:numId w:val="1026"/>
         </w:numPr>
       </w:pPr>
       <w:r>
@@ -27720,8 +29812,8 @@
         <w:t xml:space="preserve">.</w:t>
       </w:r>
     </w:p>
-    <w:bookmarkEnd w:id="100"/>
-    <w:bookmarkStart w:id="110" w:name="references"/>
+    <w:bookmarkEnd w:id="110"/>
+    <w:bookmarkStart w:id="120" w:name="references"/>
     <w:p>
       <w:pPr>
         <w:pStyle w:val="Heading2"/>
@@ -27730,8 +29822,8 @@
         <w:t xml:space="preserve">References</w:t>
       </w:r>
     </w:p>
-    <w:bookmarkStart w:id="109" w:name="refs"/>
-    <w:bookmarkStart w:id="102" w:name="ref-barkerplummer2011language"/>
+    <w:bookmarkStart w:id="119" w:name="refs"/>
+    <w:bookmarkStart w:id="112" w:name="ref-barkerplummer2011language"/>
     <w:p>
       <w:pPr>
         <w:pStyle w:val="Bibliography"/>
@@ -27755,7 +29847,7 @@
       <w:r>
         <w:t xml:space="preserve"> </w:t>
       </w:r>
-      <w:hyperlink r:id="rId101">
+      <w:hyperlink r:id="rId111">
         <w:r>
           <w:rPr>
             <w:rStyle w:val="Hyperlink"/>
@@ -27767,8 +29859,8 @@
         <w:t xml:space="preserve">.</w:t>
       </w:r>
     </w:p>
-    <w:bookmarkEnd w:id="102"/>
-    <w:bookmarkStart w:id="104" w:name="ref-devlin1993joy"/>
+    <w:bookmarkEnd w:id="112"/>
+    <w:bookmarkStart w:id="114" w:name="ref-devlin1993joy"/>
     <w:p>
       <w:pPr>
         <w:pStyle w:val="Bibliography"/>
@@ -27792,7 +29884,7 @@
       <w:r>
         <w:t xml:space="preserve"> </w:t>
       </w:r>
-      <w:hyperlink r:id="rId103">
+      <w:hyperlink r:id="rId113">
         <w:r>
           <w:rPr>
             <w:rStyle w:val="Hyperlink"/>
@@ -27804,8 +29896,8 @@
         <w:t xml:space="preserve">.</w:t>
       </w:r>
     </w:p>
-    <w:bookmarkEnd w:id="104"/>
-    <w:bookmarkStart w:id="106" w:name="ref-enderton2001logic"/>
+    <w:bookmarkEnd w:id="114"/>
+    <w:bookmarkStart w:id="116" w:name="ref-enderton2001logic"/>
     <w:p>
       <w:pPr>
         <w:pStyle w:val="Bibliography"/>
@@ -27829,7 +29921,7 @@
       <w:r>
         <w:t xml:space="preserve"> </w:t>
       </w:r>
-      <w:hyperlink r:id="rId105">
+      <w:hyperlink r:id="rId115">
         <w:r>
           <w:rPr>
             <w:rStyle w:val="Hyperlink"/>
@@ -27841,8 +29933,8 @@
         <w:t xml:space="preserve">.</w:t>
       </w:r>
     </w:p>
-    <w:bookmarkEnd w:id="106"/>
-    <w:bookmarkStart w:id="108" w:name="ref-halmos1974naive"/>
+    <w:bookmarkEnd w:id="116"/>
+    <w:bookmarkStart w:id="118" w:name="ref-halmos1974naive"/>
     <w:p>
       <w:pPr>
         <w:pStyle w:val="Bibliography"/>
@@ -27866,7 +29958,7 @@
       <w:r>
         <w:t xml:space="preserve"> </w:t>
       </w:r>
-      <w:hyperlink r:id="rId107">
+      <w:hyperlink r:id="rId117">
         <w:r>
           <w:rPr>
             <w:rStyle w:val="Hyperlink"/>
@@ -27878,9 +29970,9 @@
         <w:t xml:space="preserve">.</w:t>
       </w:r>
     </w:p>
-    <w:bookmarkEnd w:id="108"/>
-    <w:bookmarkEnd w:id="109"/>
-    <w:bookmarkEnd w:id="110"/>
+    <w:bookmarkEnd w:id="118"/>
+    <w:bookmarkEnd w:id="119"/>
+    <w:bookmarkEnd w:id="120"/>
     <w:sectPr>
       <w:footnotePr>
         <w:numRestart w:val="eachSect"/>
@@ -28270,6 +30362,21 @@
     <w:abstractNumId w:val="991"/>
   </w:num>
   <w:num w:numId="1021">
+    <w:abstractNumId w:val="991"/>
+  </w:num>
+  <w:num w:numId="1022">
+    <w:abstractNumId w:val="991"/>
+  </w:num>
+  <w:num w:numId="1023">
+    <w:abstractNumId w:val="991"/>
+  </w:num>
+  <w:num w:numId="1024">
+    <w:abstractNumId w:val="991"/>
+  </w:num>
+  <w:num w:numId="1025">
+    <w:abstractNumId w:val="991"/>
+  </w:num>
+  <w:num w:numId="1026">
     <w:abstractNumId w:val="991"/>
   </w:num>
 </w:numbering>

</xml_diff>